<commit_message>
Changes made to proposal and project report
</commit_message>
<xml_diff>
--- a/Project_Proposal.docx
+++ b/Project_Proposal.docx
@@ -206,7 +206,16 @@
           <w:sz w:val="26"/>
           <w:szCs w:val="26"/>
         </w:rPr>
-        <w:t>APRIL, 2026</w:t>
+        <w:t>July</w:t>
+      </w:r>
+      <w:r>
+        <w:rPr>
+          <w:b/>
+          <w:bCs/>
+          <w:sz w:val="26"/>
+          <w:szCs w:val="26"/>
+        </w:rPr>
+        <w:t>, 2026</w:t>
       </w:r>
     </w:p>
     <w:p>
@@ -267,22 +276,14 @@
         <w:jc w:val="both"/>
       </w:pPr>
       <w:r>
-        <w:t xml:space="preserve">Student dropout has remained one of the most stubborn problems confronting higher education across the world, and Nigeria is not left out. Every year, thousands of students who gain admission into Nigerian universities through the Joint Admissions and Matriculation Board (JAMB) fail to complete their degree </w:t>
-      </w:r>
-      <w:proofErr w:type="spellStart"/>
-      <w:r>
-        <w:t>programmes</w:t>
-      </w:r>
-      <w:proofErr w:type="spellEnd"/>
-      <w:r>
-        <w:t xml:space="preserve">. Some withdraw on their own, others are dismissed on academic grounds, while a sizeable number simply stop attending lectures without giving any formal notice. Whatever the route, the outcome is usually the same: wasted resources, unused potential, and a heavy emotional burden on the student and the family that paid the bills </w:t>
-      </w:r>
-      <w:r>
-        <w:rPr>
-          <w:b/>
-          <w:bCs/>
-        </w:rPr>
-        <w:t>(Jiménez et al., 2023)</w:t>
+        <w:t xml:space="preserve">Student dropout has remained one of the most stubborn problems confronting higher education across the world, and Nigeria is not left out. Every year, thousands of students who gain admission into Nigerian universities fail to complete their degree programmes. Some withdraw on their own, others are dismissed on academic grounds, while a sizeable number simply stop attending lectures without giving any formal notice. Whatever the route, the outcome is usually the same: wasted resources, unused potential, and a heavy emotional burden on the student and the family that paid the bills </w:t>
+      </w:r>
+      <w:r>
+        <w:rPr>
+          <w:b/>
+          <w:bCs/>
+        </w:rPr>
+        <w:t>(Jiménez et al., 2023; Mukooyo &amp; Kasse, 2024)</w:t>
       </w:r>
       <w:r>
         <w:t>.</w:t>
@@ -294,14 +295,14 @@
         <w:jc w:val="both"/>
       </w:pPr>
       <w:r>
-        <w:t xml:space="preserve">The scale of the problem is troubling, as recent reports suggest that completion rates in many Nigerian federal universities sit below sixty-five percent. This means that more than one out of every three students who begin a degree do not finish it within the expected time. This situation is even more acute in rigorous courses with high failure rates, such as Engineering, Medicine, and Computer Science, where the pressure to perform often results in higher exit rates </w:t>
-      </w:r>
-      <w:r>
-        <w:rPr>
-          <w:b/>
-          <w:bCs/>
-        </w:rPr>
-        <w:t>(Villar &amp; Velini de Andrade, 2024)</w:t>
+        <w:t xml:space="preserve">The scale of the problem is troubling. Recent reports suggest that completion rates in many Nigerian federal universities sit below sixty-five percent, meaning that more than one out of every three students who begin a degree do not finish it within the expected time. The situation will likely be even more acute in rigorous STEM courses with high failure rates, such as Computer Science, where the pressure to perform often results in higher exit rates </w:t>
+      </w:r>
+      <w:r>
+        <w:rPr>
+          <w:b/>
+          <w:bCs/>
+        </w:rPr>
+        <w:t>(Naseem et al., 2021; Villar &amp; Velini de Andrade, 2024)</w:t>
       </w:r>
       <w:r>
         <w:t>.</w:t>
@@ -313,46 +314,34 @@
         <w:jc w:val="both"/>
       </w:pPr>
       <w:r>
-        <w:t xml:space="preserve">A significant challenge is that non-academic factors often contribute more to student dropout than purely academic ones. Financial hardship caused by the rising cost of living and unstable family income frequently pushes students out of school. Furthermore, frequent academic disruptions—most notably the long ASUU strikes of 2020 and 2022—have broken study momentum, leading many students to lose interest entirely. These factors are further complicated by poor academic preparation from secondary school, weak campus counseling structures, and personal challenges like illness or early marriage </w:t>
-      </w:r>
-      <w:r>
-        <w:rPr>
-          <w:b/>
-          <w:bCs/>
-        </w:rPr>
-        <w:t>(</w:t>
-      </w:r>
-      <w:proofErr w:type="spellStart"/>
-      <w:r>
-        <w:rPr>
-          <w:b/>
-          <w:bCs/>
-        </w:rPr>
-        <w:t>Alarape</w:t>
-      </w:r>
-      <w:proofErr w:type="spellEnd"/>
-      <w:r>
-        <w:rPr>
-          <w:b/>
-          <w:bCs/>
-        </w:rPr>
-        <w:t xml:space="preserve">, 2021; Jiménez et al., 2023; </w:t>
-      </w:r>
-      <w:proofErr w:type="spellStart"/>
-      <w:r>
-        <w:rPr>
-          <w:b/>
-          <w:bCs/>
-        </w:rPr>
-        <w:t>Mukooyo</w:t>
-      </w:r>
-      <w:proofErr w:type="spellEnd"/>
-      <w:r>
-        <w:rPr>
-          <w:b/>
-          <w:bCs/>
-        </w:rPr>
-        <w:t xml:space="preserve"> &amp; Kasse, 2024)</w:t>
+        <w:t xml:space="preserve">A significant challenge is that non-academic factors often contribute more to student dropout than purely academic ones </w:t>
+      </w:r>
+      <w:r>
+        <w:rPr>
+          <w:b/>
+          <w:bCs/>
+        </w:rPr>
+        <w:t>(Mukooyo &amp; Kasse, 2024)</w:t>
+      </w:r>
+      <w:r>
+        <w:t xml:space="preserve">. Financial hardship caused by the rising cost of living and unstable family income pushes many students out of school. Frequent academic disruptions, including the long ASUU strikes, have also broken study momentum and made some students lose interest entirely. This project </w:t>
+      </w:r>
+      <w:r>
+        <w:rPr>
+          <w:b/>
+          <w:bCs/>
+        </w:rPr>
+        <w:t>will investigate</w:t>
+      </w:r>
+      <w:r>
+        <w:t xml:space="preserve"> how poor academic preparation and weak counseling structures contribute to this phenomenon within the Nigerian context </w:t>
+      </w:r>
+      <w:r>
+        <w:rPr>
+          <w:b/>
+          <w:bCs/>
+        </w:rPr>
+        <w:t>(Alarape, 2021; Jiménez et al., 2023)</w:t>
       </w:r>
       <w:r>
         <w:t>.</w:t>
@@ -364,14 +353,34 @@
         <w:jc w:val="both"/>
       </w:pPr>
       <w:r>
-        <w:t xml:space="preserve">Most Nigerian universities currently only realize a student is at risk after the damage is done, typically when results are released and the student is already on probation or has been advised to withdraw. By the time the institution identifies the struggle, it is often too late to intervene meaningfully. This reactive approach prevents the implementation of early-warning strategies that could save a student's academic career before they reach the point of failure </w:t>
-      </w:r>
-      <w:r>
-        <w:rPr>
-          <w:b/>
-          <w:bCs/>
-        </w:rPr>
-        <w:t>(Zhao &amp; Ren, 2025)</w:t>
+        <w:t xml:space="preserve">What makes the situation more frustrating is that most universities only realise a student is at risk after the damage is done. The existing approach in many Nigerian universities depends on manual observation by lecturers and student affairs officers, which is reactive, slow and unable to scale across large student populations </w:t>
+      </w:r>
+      <w:r>
+        <w:rPr>
+          <w:b/>
+          <w:bCs/>
+        </w:rPr>
+        <w:t>(Bashiru &amp; Malgwi, 2026; Zhao &amp; Ren, 2025)</w:t>
+      </w:r>
+      <w:r>
+        <w:t xml:space="preserve">. This project </w:t>
+      </w:r>
+      <w:r>
+        <w:rPr>
+          <w:b/>
+          <w:bCs/>
+        </w:rPr>
+        <w:t>will address</w:t>
+      </w:r>
+      <w:r>
+        <w:t xml:space="preserve"> this limitation by shifting toward a data-driven early-warning system that can detect risk patterns before failure occurs </w:t>
+      </w:r>
+      <w:r>
+        <w:rPr>
+          <w:b/>
+          <w:bCs/>
+        </w:rPr>
+        <w:t>(Arifudin et al., 2026)</w:t>
       </w:r>
       <w:r>
         <w:t>.</w:t>
@@ -384,14 +393,74 @@
       </w:pPr>
       <w:r>
         <w:lastRenderedPageBreak/>
-        <w:t xml:space="preserve">The existing approach in many Nigerian universities depends heavily on manual observation by lecturers and student affairs officers, which is slow, subjective, and prone to error. With some universities now hosting more than fifty thousand students on a single campus, manual monitoring has become practically impossible. The system is unable to scale across such large student populations, leaving thousands of students without the oversight necessary to identify their risk of dropping out </w:t>
-      </w:r>
-      <w:r>
-        <w:rPr>
-          <w:b/>
-          <w:bCs/>
-        </w:rPr>
-        <w:t>(Zhao &amp; Ren, 2025)</w:t>
+        <w:t xml:space="preserve">While previous Nigerian studies have demonstrated that standalone classification algorithms can predict outcomes, few have explored </w:t>
+      </w:r>
+      <w:r>
+        <w:rPr>
+          <w:b/>
+          <w:bCs/>
+        </w:rPr>
+        <w:t>ensemble machine learning approaches</w:t>
+      </w:r>
+      <w:r>
+        <w:t xml:space="preserve"> that integrate multiple models to improve predictive robustness and generalization </w:t>
+      </w:r>
+      <w:r>
+        <w:rPr>
+          <w:b/>
+          <w:bCs/>
+        </w:rPr>
+        <w:t>(Fatima et al., 2023; Niyogisubizo et al., 2022)</w:t>
+      </w:r>
+      <w:r>
+        <w:t xml:space="preserve">. Furthermore, local research rarely addresses critical issues such as </w:t>
+      </w:r>
+      <w:r>
+        <w:rPr>
+          <w:b/>
+          <w:bCs/>
+        </w:rPr>
+        <w:t>class imbalance</w:t>
+      </w:r>
+      <w:r>
+        <w:t xml:space="preserve"> and </w:t>
+      </w:r>
+      <w:r>
+        <w:rPr>
+          <w:b/>
+          <w:bCs/>
+        </w:rPr>
+        <w:t>model explainability</w:t>
+      </w:r>
+      <w:r>
+        <w:t xml:space="preserve">. Consequently, this project </w:t>
+      </w:r>
+      <w:r>
+        <w:rPr>
+          <w:b/>
+          <w:bCs/>
+        </w:rPr>
+        <w:t>will develop</w:t>
+      </w:r>
+      <w:r>
+        <w:t xml:space="preserve"> a </w:t>
+      </w:r>
+      <w:r>
+        <w:rPr>
+          <w:b/>
+          <w:bCs/>
+        </w:rPr>
+        <w:t>Stacking Ensemble model</w:t>
+      </w:r>
+      <w:r>
+        <w:t xml:space="preserve">—combining multiple learners to surpass the robustness of single algorithms—to provide an accessible interface that transforms dormant registry data into implementable predictions </w:t>
+      </w:r>
+      <w:r>
+        <w:rPr>
+          <w:b/>
+          <w:bCs/>
+        </w:rPr>
+        <w:t>(Arifudin et al., 2026; Pecuchova &amp; Drlik, 2023; Zhao &amp; Ren, 2025)</w:t>
       </w:r>
       <w:r>
         <w:t>.</w:t>
@@ -402,108 +471,12 @@
         <w:spacing w:before="120" w:after="120" w:line="360" w:lineRule="auto"/>
         <w:jc w:val="both"/>
       </w:pPr>
-      <w:r>
-        <w:t xml:space="preserve">Recent advances in machine learning yield a promising way out of this problem. Studies in different parts of the world have shown that machine learning models are able to </w:t>
-      </w:r>
-      <w:proofErr w:type="spellStart"/>
-      <w:r>
-        <w:t>analyse</w:t>
-      </w:r>
-      <w:proofErr w:type="spellEnd"/>
-      <w:r>
-        <w:t xml:space="preserve"> a student's academic, demographic and financial information and flag those who are likely to drop out before the situation gets worse </w:t>
-      </w:r>
-      <w:r>
-        <w:rPr>
-          <w:b/>
-          <w:bCs/>
-        </w:rPr>
-        <w:t xml:space="preserve">(Hassan et al., 2024; </w:t>
-      </w:r>
-      <w:proofErr w:type="spellStart"/>
-      <w:r>
-        <w:rPr>
-          <w:b/>
-          <w:bCs/>
-        </w:rPr>
-        <w:t>Mduma</w:t>
-      </w:r>
-      <w:proofErr w:type="spellEnd"/>
-      <w:r>
-        <w:rPr>
-          <w:b/>
-          <w:bCs/>
-        </w:rPr>
-        <w:t xml:space="preserve"> et al., 2019; Villar &amp; Velini de Andrade, 2024)</w:t>
-      </w:r>
-      <w:r>
-        <w:t xml:space="preserve">. Closer to home, work done in Nigerian universities has demonstrated that classification algorithms such as Logistic Regression, Random Forest along with Support Vector Machine can predict student outcomes with very high accuracy being trained on the right features </w:t>
-      </w:r>
-      <w:r>
-        <w:rPr>
-          <w:b/>
-          <w:bCs/>
-        </w:rPr>
-        <w:t xml:space="preserve">(Bashiru &amp; </w:t>
-      </w:r>
-      <w:proofErr w:type="spellStart"/>
-      <w:r>
-        <w:rPr>
-          <w:b/>
-          <w:bCs/>
-        </w:rPr>
-        <w:t>Malgwi</w:t>
-      </w:r>
-      <w:proofErr w:type="spellEnd"/>
-      <w:r>
-        <w:rPr>
-          <w:b/>
-          <w:bCs/>
-        </w:rPr>
-        <w:t xml:space="preserve">, 2026; Fatima et al., 2023; </w:t>
-      </w:r>
-      <w:proofErr w:type="spellStart"/>
-      <w:r>
-        <w:rPr>
-          <w:b/>
-          <w:bCs/>
-        </w:rPr>
-        <w:t>Osemwegie</w:t>
-      </w:r>
-      <w:proofErr w:type="spellEnd"/>
-      <w:r>
-        <w:rPr>
-          <w:b/>
-          <w:bCs/>
-        </w:rPr>
-        <w:t xml:space="preserve"> &amp; Amadin, 2023)</w:t>
-      </w:r>
-      <w:r>
-        <w:t xml:space="preserve">. When such predictions are made early enough, schools can step in with focused support such as counselling, scholarships, coaching or remedial classes. This project is inspired by the need to bring this kind of data-focused early-warning system into the Nigerian university context, where it is currently absent or poorly developed </w:t>
-      </w:r>
-      <w:r>
-        <w:rPr>
-          <w:b/>
-          <w:bCs/>
-        </w:rPr>
-        <w:t>(Zhao &amp; Ren, 2025)</w:t>
-      </w:r>
-      <w:r>
-        <w:t>.</w:t>
-      </w:r>
     </w:p>
     <w:p>
       <w:pPr>
         <w:spacing w:before="120" w:after="120" w:line="360" w:lineRule="auto"/>
         <w:jc w:val="both"/>
-        <w:rPr>
-          <w:b/>
-          <w:bCs/>
-        </w:rPr>
-      </w:pPr>
-      <w:r>
-        <w:br w:type="page"/>
-      </w:r>
+      </w:pPr>
     </w:p>
     <w:p>
       <w:pPr>
@@ -519,7 +492,6 @@
           <w:b/>
           <w:bCs/>
         </w:rPr>
-        <w:lastRenderedPageBreak/>
         <w:t>3.0 PROBLEM STATEMENT</w:t>
       </w:r>
     </w:p>
@@ -529,43 +501,17 @@
         <w:jc w:val="both"/>
       </w:pPr>
       <w:r>
-        <w:t xml:space="preserve">Nigerian universities currently lack an automated system that can predict, with reasonable accuracy, which students are likely to drop out of their degree </w:t>
-      </w:r>
-      <w:proofErr w:type="spellStart"/>
-      <w:r>
-        <w:t>programmes</w:t>
-      </w:r>
-      <w:proofErr w:type="spellEnd"/>
-      <w:r>
-        <w:t xml:space="preserve">. The existing approach depends heavily on manual observation by lecturers and student affairs officers, which is slow, subjective and unable to scale across the large student populations on most campuses (Bashiru &amp; </w:t>
-      </w:r>
-      <w:proofErr w:type="spellStart"/>
-      <w:r>
-        <w:t>Malgwi</w:t>
-      </w:r>
-      <w:proofErr w:type="spellEnd"/>
-      <w:r>
-        <w:t xml:space="preserve">, 2026; </w:t>
-      </w:r>
-      <w:r>
-        <w:rPr>
-          <w:b/>
-          <w:bCs/>
-        </w:rPr>
-        <w:t>Zhao &amp; Ren, 2025</w:t>
-      </w:r>
-      <w:r>
-        <w:t xml:space="preserve">). By the time a struggling student is noticed, intervention is usually too late to make any real difference </w:t>
-      </w:r>
-      <w:r>
-        <w:rPr>
-          <w:b/>
-          <w:bCs/>
-        </w:rPr>
-        <w:t>(Jiménez et al., 2023)</w:t>
-      </w:r>
-      <w:r>
-        <w:t>.</w:t>
+        <w:t xml:space="preserve">Nigerian universities currently lack a robust automated system that can predict student dropout with high accuracy. The existing approach depends heavily on manual observation, which is slow, subjective, and unable to scale across large student populations (Bashiru &amp; Malgwi, 2026; Zhao &amp; Ren, 2025). Furthermore, most existing predictive efforts in Nigeria rely on </w:t>
+      </w:r>
+      <w:r>
+        <w:rPr>
+          <w:b/>
+          <w:bCs/>
+        </w:rPr>
+        <w:t>standalone classifiers</w:t>
+      </w:r>
+      <w:r>
+        <w:t xml:space="preserve"> that often exhibit limited sensitivity and reduced robustness when handling complex educational data (Arifudin et al., 2026; Pecuchova &amp; Drlik, 2023). By the time a struggling student is identified through manual means, intervention is usually too late to facilitate a successful academic recovery (Jiménez et al., 2023).</w:t>
       </w:r>
     </w:p>
     <w:p>
@@ -574,49 +520,54 @@
         <w:jc w:val="both"/>
       </w:pPr>
       <w:r>
-        <w:t xml:space="preserve">There is therefore a clear gap between the volume of student data already collected by university registries (admission records, semester results, fee payment status, demographic information) and the absence of an analytical tool that can convert that data into implementable predictions </w:t>
-      </w:r>
-      <w:r>
-        <w:rPr>
-          <w:b/>
-          <w:bCs/>
-        </w:rPr>
-        <w:t>(Jiménez et al., 2023; Villar &amp; Velini de Andrade, 2024)</w:t>
-      </w:r>
-      <w:r>
-        <w:t>. This gap is even more pronounced in developing countries, where research on the use of machine learning for dropout prediction continues to be limited compared to Europe and North America (</w:t>
-      </w:r>
-      <w:proofErr w:type="spellStart"/>
-      <w:r>
-        <w:t>Mduma</w:t>
-      </w:r>
-      <w:proofErr w:type="spellEnd"/>
-      <w:r>
-        <w:t xml:space="preserve"> et al., 2019). This project inferred to these problems by building a machine learning model that classifies students into dropout-risk categories and exposes the predictions via a simple web interface that even non-technical staff can use </w:t>
-      </w:r>
-      <w:r>
-        <w:rPr>
-          <w:b/>
-          <w:bCs/>
-        </w:rPr>
-        <w:t>(Fatima et al., 2023; Zhao &amp; Ren, 2025)</w:t>
-      </w:r>
-      <w:r>
-        <w:t>.</w:t>
+        <w:t xml:space="preserve">There is therefore a clear gap between the volume of student data already collected by university registries and the absence of an analytical tool that can convert that data into implementable predictions (Jiménez et al., 2023; Villar &amp; Velini de Andrade, 2024). This gap is further complicated by the issue of </w:t>
+      </w:r>
+      <w:r>
+        <w:rPr>
+          <w:b/>
+          <w:bCs/>
+        </w:rPr>
+        <w:t>class imbalance</w:t>
+      </w:r>
+      <w:r>
+        <w:t xml:space="preserve">, where graduating students significantly outnumber dropouts, leading single-algorithm models to produce biased results (Niyogisubizo et al., 2022; Arifudin et al., 2026). This project </w:t>
+      </w:r>
+      <w:r>
+        <w:rPr>
+          <w:b/>
+          <w:bCs/>
+        </w:rPr>
+        <w:t>will address</w:t>
+      </w:r>
+      <w:r>
+        <w:t xml:space="preserve"> these problems by building a </w:t>
+      </w:r>
+      <w:r>
+        <w:rPr>
+          <w:b/>
+          <w:bCs/>
+        </w:rPr>
+        <w:t>Stacking Ensemble machine learning model</w:t>
+      </w:r>
+      <w:r>
+        <w:t xml:space="preserve"> that integrates heterogeneous base learners to improve predictive performance. The system </w:t>
+      </w:r>
+      <w:r>
+        <w:rPr>
+          <w:b/>
+          <w:bCs/>
+        </w:rPr>
+        <w:t>will classify</w:t>
+      </w:r>
+      <w:r>
+        <w:t xml:space="preserve"> students into dropout-risk categories and expose the results via a simple web interface for early intervention by academic staff (Fatima et al., 2023; Zhao &amp; Ren, 2025).</w:t>
       </w:r>
     </w:p>
     <w:p>
       <w:pPr>
         <w:spacing w:before="120" w:after="120" w:line="360" w:lineRule="auto"/>
         <w:jc w:val="both"/>
-        <w:rPr>
-          <w:b/>
-          <w:bCs/>
-        </w:rPr>
-      </w:pPr>
-      <w:r>
-        <w:br w:type="page"/>
-      </w:r>
+      </w:pPr>
     </w:p>
     <w:p>
       <w:pPr>
@@ -628,6 +579,19 @@
         </w:rPr>
       </w:pPr>
       <w:r>
+        <w:br w:type="page"/>
+      </w:r>
+    </w:p>
+    <w:p>
+      <w:pPr>
+        <w:spacing w:before="120" w:after="120" w:line="360" w:lineRule="auto"/>
+        <w:jc w:val="both"/>
+        <w:rPr>
+          <w:b/>
+          <w:bCs/>
+        </w:rPr>
+      </w:pPr>
+      <w:r>
         <w:rPr>
           <w:b/>
           <w:bCs/>
@@ -658,13 +622,17 @@
         <w:spacing w:before="120" w:after="120" w:line="360" w:lineRule="auto"/>
       </w:pPr>
       <w:r>
-        <w:t xml:space="preserve">The aim of this project is to design, implement and deploy a machine learning-based system that </w:t>
-      </w:r>
-      <w:r>
-        <w:t xml:space="preserve">can </w:t>
-      </w:r>
-      <w:r>
-        <w:t>predicts the likelihood of student dropout in Nigerian universities and presents the predictions via a user-friendly web application.</w:t>
+        <w:t xml:space="preserve">The aim of this project is to develop, evaluate, and deploy a </w:t>
+      </w:r>
+      <w:r>
+        <w:rPr>
+          <w:b/>
+          <w:bCs/>
+        </w:rPr>
+        <w:t>Stacking Ensemble machine learning model</w:t>
+      </w:r>
+      <w:r>
+        <w:t xml:space="preserve"> that integrates multiple classifiers to predict the likelihood of student dropout in Nigerian universities, presenting the results via a user-friendly web application.</w:t>
       </w:r>
     </w:p>
     <w:p>
@@ -703,21 +671,12 @@
         <w:pStyle w:val="ListParagraph"/>
         <w:numPr>
           <w:ilvl w:val="0"/>
-          <w:numId w:val="3"/>
+          <w:numId w:val="8"/>
         </w:numPr>
         <w:spacing w:before="120" w:after="120" w:line="360" w:lineRule="auto"/>
       </w:pPr>
       <w:r>
-        <w:t>To analy</w:t>
-      </w:r>
-      <w:r>
-        <w:t>z</w:t>
-      </w:r>
-      <w:r>
-        <w:t>e the factors associated with student dropout.</w:t>
-      </w:r>
-      <w:r>
-        <w:t>.</w:t>
+        <w:t>To investigate the specific academic and socio-economic factors associated with student dropout in Nigerian universities and identify the research gaps in existing standalone classification methods.</w:t>
       </w:r>
     </w:p>
     <w:p>
@@ -725,12 +684,12 @@
         <w:pStyle w:val="ListParagraph"/>
         <w:numPr>
           <w:ilvl w:val="0"/>
-          <w:numId w:val="3"/>
+          <w:numId w:val="8"/>
         </w:numPr>
         <w:spacing w:before="120" w:after="120" w:line="360" w:lineRule="auto"/>
       </w:pPr>
       <w:r>
-        <w:t>To apply feature selection techniques in identifying the variables that contribute the most to dropout risk.</w:t>
+        <w:t>To apply Mutual Information (MI) feature selection techniques to identify the most significant variables that contribute to student attrition risk.</w:t>
       </w:r>
     </w:p>
     <w:p>
@@ -738,12 +697,12 @@
         <w:pStyle w:val="ListParagraph"/>
         <w:numPr>
           <w:ilvl w:val="0"/>
-          <w:numId w:val="3"/>
+          <w:numId w:val="8"/>
         </w:numPr>
         <w:spacing w:before="120" w:after="120" w:line="360" w:lineRule="auto"/>
       </w:pPr>
       <w:r>
-        <w:t>To develop three machine learning classifiers, namely Logistic Regression, Random Forest along with Support Vector Machine, on the prepared dataset.</w:t>
+        <w:t>To design and implement a Stacking Ensemble architecture comprising three base learners—Logistic Regression, Random Forest, and Support Vector Machine—synthesized by a meta-classifier to improve predictive performance.</w:t>
       </w:r>
     </w:p>
     <w:p>
@@ -751,20 +710,12 @@
         <w:pStyle w:val="ListParagraph"/>
         <w:numPr>
           <w:ilvl w:val="0"/>
-          <w:numId w:val="3"/>
+          <w:numId w:val="8"/>
         </w:numPr>
         <w:spacing w:before="120" w:after="120" w:line="360" w:lineRule="auto"/>
       </w:pPr>
       <w:r>
-        <w:t xml:space="preserve">To evaluate the performance of the three models using accuracy, precision, recall, F1-score and ROC-AUC, and deploy the best-performing one as a web-based prediction system using </w:t>
-      </w:r>
-      <w:proofErr w:type="spellStart"/>
-      <w:r>
-        <w:t>Streamlit</w:t>
-      </w:r>
-      <w:proofErr w:type="spellEnd"/>
-      <w:r>
-        <w:t>.</w:t>
+        <w:t>To evaluate the performance of the ensemble model using accuracy, precision, recall, F1-score, and ROC-AUC, and deploy the system as a web-based prediction tool through the Streamlit framework.</w:t>
       </w:r>
     </w:p>
     <w:p>
@@ -801,7 +752,37 @@
         <w:spacing w:before="120" w:after="120" w:line="360" w:lineRule="auto"/>
       </w:pPr>
       <w:r>
-        <w:t>This section explains how the project will be carried out. It begins with the conceptual architecture of the proposed system, then lists the tools and technologies that will be used, and ends with a step-by-step description of the technique.</w:t>
+        <w:t xml:space="preserve">This section </w:t>
+      </w:r>
+      <w:r>
+        <w:rPr>
+          <w:b/>
+          <w:bCs/>
+        </w:rPr>
+        <w:t>will explain</w:t>
+      </w:r>
+      <w:r>
+        <w:t xml:space="preserve"> the technical framework for the project. It </w:t>
+      </w:r>
+      <w:r>
+        <w:rPr>
+          <w:b/>
+          <w:bCs/>
+        </w:rPr>
+        <w:t>will begin</w:t>
+      </w:r>
+      <w:r>
+        <w:t xml:space="preserve"> with the conceptual architecture of the stacking ensemble, followed by a list of tools and technologies, and </w:t>
+      </w:r>
+      <w:r>
+        <w:rPr>
+          <w:b/>
+          <w:bCs/>
+        </w:rPr>
+        <w:t>will conclude</w:t>
+      </w:r>
+      <w:r>
+        <w:t xml:space="preserve"> with a detailed description of the development steps.</w:t>
       </w:r>
     </w:p>
     <w:p>
@@ -825,43 +806,67 @@
         <w:spacing w:before="120" w:after="120" w:line="360" w:lineRule="auto"/>
       </w:pPr>
       <w:r>
-        <w:t xml:space="preserve">The proposed system is built around a three-layer architecture made up of a data layer, a model layer and a presentation layer. This kind of layered structure is consistent with early warning systems that have been proposed for similar dropout prediction tasks in African universities (Bashiru &amp; </w:t>
-      </w:r>
-      <w:proofErr w:type="spellStart"/>
-      <w:r>
-        <w:t>Malgwi</w:t>
-      </w:r>
-      <w:proofErr w:type="spellEnd"/>
-      <w:r>
-        <w:t xml:space="preserve">, 2026; </w:t>
-      </w:r>
-      <w:r>
-        <w:rPr>
-          <w:b/>
-          <w:bCs/>
-        </w:rPr>
-        <w:t>Zhao &amp; Ren, 2025</w:t>
-      </w:r>
-      <w:r>
-        <w:t xml:space="preserve">). The data layer is responsible for storing the cleaned student dataset and supplying it to the next stage. The model layer handles all the machine learning operations, including preprocessing, feature selection, training and prediction </w:t>
-      </w:r>
-      <w:r>
-        <w:rPr>
-          <w:b/>
-          <w:bCs/>
-        </w:rPr>
-        <w:t>(Fatima et al., 2023; Jiménez et al., 2023)</w:t>
-      </w:r>
-      <w:r>
-        <w:t xml:space="preserve">. The presentation layer, built with </w:t>
-      </w:r>
-      <w:proofErr w:type="spellStart"/>
-      <w:r>
-        <w:t>Streamlit</w:t>
-      </w:r>
-      <w:proofErr w:type="spellEnd"/>
-      <w:r>
-        <w:t xml:space="preserve">, is what the end user actually interacts with. Through this layer, a student affairs officer, course adviser or even the student can enter a student's information and receive a real-time prediction of dropout risk </w:t>
+        <w:t xml:space="preserve">The proposed system </w:t>
+      </w:r>
+      <w:r>
+        <w:rPr>
+          <w:b/>
+          <w:bCs/>
+        </w:rPr>
+        <w:t>will be built</w:t>
+      </w:r>
+      <w:r>
+        <w:t xml:space="preserve"> around a three-layer architecture comprising a data layer, a model layer, and a presentation layer. This layered structure is consistent with advanced early-warning frameworks proposed for dropout prediction in academic settings </w:t>
+      </w:r>
+      <w:r>
+        <w:rPr>
+          <w:b/>
+          <w:bCs/>
+        </w:rPr>
+        <w:t>(Bashiru &amp; Malgwi, 2026; Zhao &amp; Ren, 2025)</w:t>
+      </w:r>
+      <w:r>
+        <w:t xml:space="preserve">. The data layer </w:t>
+      </w:r>
+      <w:r>
+        <w:rPr>
+          <w:b/>
+          <w:bCs/>
+        </w:rPr>
+        <w:t>will be responsible</w:t>
+      </w:r>
+      <w:r>
+        <w:t xml:space="preserve"> for storing the benchmark student dataset and supply it to the preprocessing pipeline. The model layer </w:t>
+      </w:r>
+      <w:r>
+        <w:rPr>
+          <w:b/>
+          <w:bCs/>
+        </w:rPr>
+        <w:t>will handle</w:t>
+      </w:r>
+      <w:r>
+        <w:t xml:space="preserve"> the core machine learning operations, including Mutual Information-based feature selection, base learner training, and meta-model synthesis </w:t>
+      </w:r>
+      <w:r>
+        <w:rPr>
+          <w:b/>
+          <w:bCs/>
+        </w:rPr>
+        <w:t>(Fatima et al., 2023; Jiménez et al., 2023; Niyogisubizo et al., 2022)</w:t>
+      </w:r>
+      <w:r>
+        <w:t xml:space="preserve">. The presentation layer, built with Streamlit, </w:t>
+      </w:r>
+      <w:r>
+        <w:rPr>
+          <w:b/>
+          <w:bCs/>
+        </w:rPr>
+        <w:t>will provide</w:t>
+      </w:r>
+      <w:r>
+        <w:t xml:space="preserve"> the interface where the end user interacts with the system to receive real-time dropout risk assessments </w:t>
       </w:r>
       <w:r>
         <w:rPr>
@@ -879,36 +884,93 @@
         <w:spacing w:before="120" w:after="120" w:line="360" w:lineRule="auto"/>
       </w:pPr>
       <w:r>
-        <w:t xml:space="preserve">When a user submits information through the web form, the data is passed through the same preprocessing pipeline that was used during training (scaling, encoding and feature selection) </w:t>
-      </w:r>
-      <w:r>
-        <w:rPr>
-          <w:b/>
-          <w:bCs/>
-        </w:rPr>
-        <w:t>(Jiménez et al., 2023; Villar &amp; Velini de Andrade, 2024)</w:t>
-      </w:r>
-      <w:r>
-        <w:t xml:space="preserve">. The cleaned input is then fed into the trained model, which outputs a probability between zero and one. This probability is converted into a risk band (Low, Moderate or High) and displayed on the screen alongside a recommendation </w:t>
-      </w:r>
-      <w:r>
-        <w:rPr>
-          <w:b/>
-          <w:bCs/>
-        </w:rPr>
-        <w:t>(Jiménez et al., 2023)</w:t>
-      </w:r>
-      <w:r>
-        <w:t xml:space="preserve">. The system is designed to be lightweight enough to run on free cloud services like </w:t>
-      </w:r>
-      <w:proofErr w:type="spellStart"/>
-      <w:r>
-        <w:t>Streamlit</w:t>
-      </w:r>
-      <w:proofErr w:type="spellEnd"/>
-      <w:r>
-        <w:t xml:space="preserve"> Community Cloud, so it does not require any expensive infrastructure to host.</w:t>
-      </w:r>
+        <w:t xml:space="preserve">When a user submits data through the web form, the information </w:t>
+      </w:r>
+      <w:r>
+        <w:rPr>
+          <w:b/>
+          <w:bCs/>
+        </w:rPr>
+        <w:t>will be passed</w:t>
+      </w:r>
+      <w:r>
+        <w:t xml:space="preserve"> through a pipeline that replicates the training environment, including encoding and scaling via StandardScaler </w:t>
+      </w:r>
+      <w:r>
+        <w:rPr>
+          <w:b/>
+          <w:bCs/>
+        </w:rPr>
+        <w:t>(Villar &amp; de Andrade, 2024; Arifudin et al., 2026)</w:t>
+      </w:r>
+      <w:r>
+        <w:t xml:space="preserve">. The processed input </w:t>
+      </w:r>
+      <w:r>
+        <w:rPr>
+          <w:b/>
+          <w:bCs/>
+        </w:rPr>
+        <w:t>will be fed</w:t>
+      </w:r>
+      <w:r>
+        <w:t xml:space="preserve"> into the </w:t>
+      </w:r>
+      <w:r>
+        <w:rPr>
+          <w:b/>
+          <w:bCs/>
+        </w:rPr>
+        <w:t>Stacking Ensemble</w:t>
+      </w:r>
+      <w:r>
+        <w:t xml:space="preserve">, where Level 0 base learners (LR, SVM, and RF) generate initial predictions that the Level 1 meta-learner (Logistic Regression) </w:t>
+      </w:r>
+      <w:r>
+        <w:rPr>
+          <w:b/>
+          <w:bCs/>
+        </w:rPr>
+        <w:t>will synthesize</w:t>
+      </w:r>
+      <w:r>
+        <w:t xml:space="preserve"> into a final probability. This output </w:t>
+      </w:r>
+      <w:r>
+        <w:rPr>
+          <w:b/>
+          <w:bCs/>
+        </w:rPr>
+        <w:t>will be converted</w:t>
+      </w:r>
+      <w:r>
+        <w:t xml:space="preserve"> into a risk band (Low, Moderate, or High) and displayed on the screen with specific recommendations </w:t>
+      </w:r>
+      <w:r>
+        <w:rPr>
+          <w:b/>
+          <w:bCs/>
+        </w:rPr>
+        <w:t>(Jiménez et al., 2023; Pecuchova &amp; Drlik, 2023)</w:t>
+      </w:r>
+      <w:r>
+        <w:t xml:space="preserve">. The system </w:t>
+      </w:r>
+      <w:r>
+        <w:rPr>
+          <w:b/>
+          <w:bCs/>
+        </w:rPr>
+        <w:t>will be designed</w:t>
+      </w:r>
+      <w:r>
+        <w:t xml:space="preserve"> to be lightweight for hosting on free cloud services like Streamlit Community Cloud.</w:t>
+      </w:r>
+    </w:p>
+    <w:p>
+      <w:pPr>
+        <w:spacing w:before="120" w:after="120" w:line="360" w:lineRule="auto"/>
+      </w:pPr>
     </w:p>
     <w:p>
       <w:pPr>
@@ -933,7 +995,7 @@
         </w:rPr>
         <w:lastRenderedPageBreak/>
         <w:drawing>
-          <wp:anchor distT="0" distB="0" distL="114300" distR="114300" simplePos="0" relativeHeight="251658240" behindDoc="0" locked="0" layoutInCell="1" allowOverlap="1" wp14:anchorId="215BD740" wp14:editId="2C82D689">
+          <wp:anchor distT="0" distB="0" distL="114300" distR="114300" simplePos="0" relativeHeight="251658240" behindDoc="0" locked="0" layoutInCell="1" allowOverlap="1" wp14:anchorId="146706D0" wp14:editId="531D111F">
             <wp:simplePos x="1600200" y="571500"/>
             <wp:positionH relativeFrom="margin">
               <wp:align>right</wp:align>
@@ -941,10 +1003,10 @@
             <wp:positionV relativeFrom="margin">
               <wp:align>top</wp:align>
             </wp:positionV>
-            <wp:extent cx="5502910" cy="4368800"/>
-            <wp:effectExtent l="0" t="0" r="2540" b="0"/>
+            <wp:extent cx="5502910" cy="3004185"/>
+            <wp:effectExtent l="0" t="0" r="2540" b="5715"/>
             <wp:wrapSquare wrapText="bothSides"/>
-            <wp:docPr id="660356115" name="Picture 1"/>
+            <wp:docPr id="279743893" name="Picture 1"/>
             <wp:cNvGraphicFramePr>
               <a:graphicFrameLocks xmlns:a="http://schemas.openxmlformats.org/drawingml/2006/main" noChangeAspect="1"/>
             </wp:cNvGraphicFramePr>
@@ -952,7 +1014,7 @@
               <a:graphicData uri="http://schemas.openxmlformats.org/drawingml/2006/picture">
                 <pic:pic xmlns:pic="http://schemas.openxmlformats.org/drawingml/2006/picture">
                   <pic:nvPicPr>
-                    <pic:cNvPr id="660356115" name=""/>
+                    <pic:cNvPr id="279743893" name=""/>
                     <pic:cNvPicPr/>
                   </pic:nvPicPr>
                   <pic:blipFill>
@@ -970,7 +1032,7 @@
                   <pic:spPr>
                     <a:xfrm>
                       <a:off x="0" y="0"/>
-                      <a:ext cx="5502910" cy="4368800"/>
+                      <a:ext cx="5502910" cy="3004185"/>
                     </a:xfrm>
                     <a:prstGeom prst="rect">
                       <a:avLst/>
@@ -991,7 +1053,29 @@
           <w:sz w:val="22"/>
           <w:szCs w:val="22"/>
         </w:rPr>
-        <w:t>Figure 5.1: Proposed System Architecture</w:t>
+        <w:t>Figure 5.1: Proposed</w:t>
+      </w:r>
+      <w:r>
+        <w:rPr>
+          <w:b/>
+          <w:bCs/>
+          <w:i/>
+          <w:iCs/>
+          <w:sz w:val="22"/>
+          <w:szCs w:val="22"/>
+        </w:rPr>
+        <w:t xml:space="preserve"> Stacking Ensemble</w:t>
+      </w:r>
+      <w:r>
+        <w:rPr>
+          <w:b/>
+          <w:bCs/>
+          <w:i/>
+          <w:iCs/>
+          <w:sz w:val="22"/>
+          <w:szCs w:val="22"/>
+        </w:rPr>
+        <w:t xml:space="preserve"> System Architecture</w:t>
       </w:r>
     </w:p>
     <w:p>
@@ -1007,24 +1091,31 @@
       </w:pPr>
       <w:r>
         <w:rPr>
+          <w:b/>
+          <w:bCs/>
+          <w:i/>
+          <w:iCs/>
           <w:noProof/>
+          <w:sz w:val="22"/>
+          <w:szCs w:val="22"/>
         </w:rPr>
         <w:drawing>
-          <wp:inline distT="114300" distB="114300" distL="114300" distR="114300" wp14:anchorId="65659E61" wp14:editId="0679E70D">
-            <wp:extent cx="5502600" cy="3556000"/>
-            <wp:effectExtent l="0" t="0" r="0" b="0"/>
-            <wp:docPr id="2" name="image3.png"/>
-            <wp:cNvGraphicFramePr/>
+          <wp:inline distT="0" distB="0" distL="0" distR="0" wp14:anchorId="1B74E646" wp14:editId="2B0C261C">
+            <wp:extent cx="5502910" cy="3004185"/>
+            <wp:effectExtent l="0" t="0" r="2540" b="5715"/>
+            <wp:docPr id="1742629747" name="Picture 1"/>
+            <wp:cNvGraphicFramePr>
+              <a:graphicFrameLocks xmlns:a="http://schemas.openxmlformats.org/drawingml/2006/main" noChangeAspect="1"/>
+            </wp:cNvGraphicFramePr>
             <a:graphic xmlns:a="http://schemas.openxmlformats.org/drawingml/2006/main">
               <a:graphicData uri="http://schemas.openxmlformats.org/drawingml/2006/picture">
                 <pic:pic xmlns:pic="http://schemas.openxmlformats.org/drawingml/2006/picture">
                   <pic:nvPicPr>
-                    <pic:cNvPr id="0" name="image3.png"/>
-                    <pic:cNvPicPr preferRelativeResize="0"/>
+                    <pic:cNvPr id="1742629747" name=""/>
+                    <pic:cNvPicPr/>
                   </pic:nvPicPr>
                   <pic:blipFill>
                     <a:blip r:embed="rId9"/>
-                    <a:srcRect/>
                     <a:stretch>
                       <a:fillRect/>
                     </a:stretch>
@@ -1032,12 +1123,11 @@
                   <pic:spPr>
                     <a:xfrm>
                       <a:off x="0" y="0"/>
-                      <a:ext cx="5502600" cy="3556000"/>
+                      <a:ext cx="5502910" cy="3004185"/>
                     </a:xfrm>
                     <a:prstGeom prst="rect">
                       <a:avLst/>
                     </a:prstGeom>
-                    <a:ln/>
                   </pic:spPr>
                 </pic:pic>
               </a:graphicData>
@@ -1079,25 +1169,41 @@
     </w:p>
     <w:p>
       <w:pPr>
-        <w:spacing w:before="120" w:after="120" w:line="360" w:lineRule="auto"/>
-      </w:pPr>
-      <w:r>
-        <w:lastRenderedPageBreak/>
-        <w:t xml:space="preserve">The development of this project will base on a combination of open-source tools that are widely used in machine learning and web development. Choosing open-source tools also keeps the project affordable, which is an important consideration for most Nigerian undergraduate projects. The tools and their purposes are </w:t>
-      </w:r>
-      <w:proofErr w:type="spellStart"/>
-      <w:r>
-        <w:t>summarised</w:t>
-      </w:r>
-      <w:proofErr w:type="spellEnd"/>
-      <w:r>
-        <w:t xml:space="preserve"> in Table 5.1</w:t>
-      </w:r>
-    </w:p>
-    <w:p>
-      <w:pPr>
         <w:spacing w:line="360" w:lineRule="auto"/>
       </w:pPr>
+      <w:r>
+        <w:t xml:space="preserve">The development of this project </w:t>
+      </w:r>
+      <w:r>
+        <w:rPr>
+          <w:b/>
+          <w:bCs/>
+        </w:rPr>
+        <w:t>will utilize</w:t>
+      </w:r>
+      <w:r>
+        <w:t xml:space="preserve"> a selection of open-source tools recognized for their efficacy in high-performance machine learning and web deployment. Selecting open-source frameworks </w:t>
+      </w:r>
+      <w:r>
+        <w:rPr>
+          <w:b/>
+          <w:bCs/>
+        </w:rPr>
+        <w:t>will ensure</w:t>
+      </w:r>
+      <w:r>
+        <w:t xml:space="preserve"> the project remains cost-effective, which is a significant factor for undergraduate research in the Nigerian academic environment. The specific tools and their respective roles </w:t>
+      </w:r>
+      <w:r>
+        <w:rPr>
+          <w:b/>
+          <w:bCs/>
+        </w:rPr>
+        <w:t>are summarized</w:t>
+      </w:r>
+      <w:r>
+        <w:t xml:space="preserve"> in Table 5.1.</w:t>
+      </w:r>
     </w:p>
     <w:tbl>
       <w:tblPr>
@@ -1152,6 +1258,7 @@
                 <w:sz w:val="22"/>
                 <w:szCs w:val="22"/>
               </w:rPr>
+              <w:lastRenderedPageBreak/>
               <w:t>Tool / Technology</w:t>
             </w:r>
           </w:p>
@@ -1311,7 +1418,7 @@
                 <w:sz w:val="22"/>
                 <w:szCs w:val="22"/>
               </w:rPr>
-              <w:t>Main language for data preprocessing, model training and the web app</w:t>
+              <w:t>Primary language for data pipeline engineering, ensemble training, and web development.</w:t>
             </w:r>
           </w:p>
         </w:tc>
@@ -1406,23 +1513,7 @@
                 <w:sz w:val="22"/>
                 <w:szCs w:val="22"/>
               </w:rPr>
-              <w:t xml:space="preserve">Interactive notebook for writing, running and documenting Python code, exploring the dataset and </w:t>
-            </w:r>
-            <w:proofErr w:type="spellStart"/>
-            <w:r>
-              <w:rPr>
-                <w:sz w:val="22"/>
-                <w:szCs w:val="22"/>
-              </w:rPr>
-              <w:t>visualising</w:t>
-            </w:r>
-            <w:proofErr w:type="spellEnd"/>
-            <w:r>
-              <w:rPr>
-                <w:sz w:val="22"/>
-                <w:szCs w:val="22"/>
-              </w:rPr>
-              <w:t xml:space="preserve"> results</w:t>
+              <w:t>Interactive environment for iterative coding, exploratory data analysis (EDA), and algorithm testing.</w:t>
             </w:r>
           </w:p>
         </w:tc>
@@ -1517,7 +1608,7 @@
                 <w:sz w:val="22"/>
                 <w:szCs w:val="22"/>
               </w:rPr>
-              <w:t>Loading the dataset, cleaning, handling missing values and feature engineering</w:t>
+              <w:t>Efficient handling of student datasets, cleaning, and matrix-based mathematical operations.</w:t>
             </w:r>
           </w:p>
         </w:tc>
@@ -1612,7 +1703,39 @@
                 <w:sz w:val="22"/>
                 <w:szCs w:val="22"/>
               </w:rPr>
-              <w:t>Implementation of Logistic Regression, Random Forest and SVM, plus evaluation metrics</w:t>
+              <w:t xml:space="preserve">Implementation of Logistic Regression, Random Forest, SVM, </w:t>
+            </w:r>
+            <w:r>
+              <w:rPr>
+                <w:b/>
+                <w:bCs/>
+                <w:sz w:val="22"/>
+                <w:szCs w:val="22"/>
+              </w:rPr>
+              <w:t>StackingClassifier</w:t>
+            </w:r>
+            <w:r>
+              <w:rPr>
+                <w:sz w:val="22"/>
+                <w:szCs w:val="22"/>
+              </w:rPr>
+              <w:t xml:space="preserve">, and </w:t>
+            </w:r>
+            <w:r>
+              <w:rPr>
+                <w:b/>
+                <w:bCs/>
+                <w:sz w:val="22"/>
+                <w:szCs w:val="22"/>
+              </w:rPr>
+              <w:t>Mutual Information</w:t>
+            </w:r>
+            <w:r>
+              <w:rPr>
+                <w:sz w:val="22"/>
+                <w:szCs w:val="22"/>
+              </w:rPr>
+              <w:t xml:space="preserve"> scores.</w:t>
             </w:r>
           </w:p>
         </w:tc>
@@ -1639,13 +1762,19 @@
             <w:pPr>
               <w:spacing w:line="360" w:lineRule="auto"/>
               <w:jc w:val="center"/>
-            </w:pPr>
-            <w:r>
-              <w:rPr>
-                <w:sz w:val="22"/>
-                <w:szCs w:val="22"/>
-              </w:rPr>
-              <w:t>Matplotlib, Seaborn</w:t>
+              <w:rPr>
+                <w:sz w:val="22"/>
+                <w:szCs w:val="22"/>
+              </w:rPr>
+            </w:pPr>
+            <w:r>
+              <w:rPr>
+                <w:b/>
+                <w:bCs/>
+                <w:sz w:val="22"/>
+                <w:szCs w:val="22"/>
+              </w:rPr>
+              <w:t>XGBoost, LightGBM</w:t>
             </w:r>
           </w:p>
         </w:tc>
@@ -1670,13 +1799,19 @@
             <w:pPr>
               <w:spacing w:line="360" w:lineRule="auto"/>
               <w:jc w:val="center"/>
-            </w:pPr>
-            <w:r>
-              <w:rPr>
-                <w:sz w:val="22"/>
-                <w:szCs w:val="22"/>
-              </w:rPr>
-              <w:t>Visualization</w:t>
+              <w:rPr>
+                <w:sz w:val="22"/>
+                <w:szCs w:val="22"/>
+              </w:rPr>
+            </w:pPr>
+            <w:r>
+              <w:rPr>
+                <w:b/>
+                <w:bCs/>
+                <w:sz w:val="22"/>
+                <w:szCs w:val="22"/>
+              </w:rPr>
+              <w:t>Boosting libraries</w:t>
             </w:r>
           </w:p>
         </w:tc>
@@ -1701,13 +1836,19 @@
             <w:pPr>
               <w:spacing w:line="360" w:lineRule="auto"/>
               <w:jc w:val="center"/>
-            </w:pPr>
-            <w:r>
-              <w:rPr>
-                <w:sz w:val="22"/>
-                <w:szCs w:val="22"/>
-              </w:rPr>
-              <w:t>Plotting confusion matrices, ROC curves, feature importance and other charts</w:t>
+              <w:rPr>
+                <w:sz w:val="22"/>
+                <w:szCs w:val="22"/>
+              </w:rPr>
+            </w:pPr>
+            <w:r>
+              <w:rPr>
+                <w:b/>
+                <w:bCs/>
+                <w:sz w:val="22"/>
+                <w:szCs w:val="22"/>
+              </w:rPr>
+              <w:t>Vanguard gradient boosting algorithms used as high-performance base learners in the stacking ensemble.</w:t>
             </w:r>
           </w:p>
         </w:tc>
@@ -1735,15 +1876,13 @@
               <w:spacing w:line="360" w:lineRule="auto"/>
               <w:jc w:val="center"/>
             </w:pPr>
-            <w:proofErr w:type="spellStart"/>
-            <w:r>
-              <w:rPr>
-                <w:sz w:val="22"/>
-                <w:szCs w:val="22"/>
-              </w:rPr>
-              <w:t>Joblib</w:t>
-            </w:r>
-            <w:proofErr w:type="spellEnd"/>
+            <w:r>
+              <w:rPr>
+                <w:sz w:val="22"/>
+                <w:szCs w:val="22"/>
+              </w:rPr>
+              <w:t>Matplotlib, Seaborn</w:t>
+            </w:r>
           </w:p>
         </w:tc>
         <w:tc>
@@ -1773,7 +1912,7 @@
                 <w:sz w:val="22"/>
                 <w:szCs w:val="22"/>
               </w:rPr>
-              <w:t>Model persistence</w:t>
+              <w:t>Visualization</w:t>
             </w:r>
           </w:p>
         </w:tc>
@@ -1804,7 +1943,7 @@
                 <w:sz w:val="22"/>
                 <w:szCs w:val="22"/>
               </w:rPr>
-              <w:t>Saving and loading the trained model and the scaler</w:t>
+              <w:t>Generating ROC curves, confusion matrices, and Mutual Information (MI) feature importance charts.</w:t>
             </w:r>
           </w:p>
         </w:tc>
@@ -1832,15 +1971,13 @@
               <w:spacing w:line="360" w:lineRule="auto"/>
               <w:jc w:val="center"/>
             </w:pPr>
-            <w:proofErr w:type="spellStart"/>
-            <w:r>
-              <w:rPr>
-                <w:sz w:val="22"/>
-                <w:szCs w:val="22"/>
-              </w:rPr>
-              <w:t>Streamlit</w:t>
-            </w:r>
-            <w:proofErr w:type="spellEnd"/>
+            <w:r>
+              <w:rPr>
+                <w:sz w:val="22"/>
+                <w:szCs w:val="22"/>
+              </w:rPr>
+              <w:t>Joblib</w:t>
+            </w:r>
           </w:p>
         </w:tc>
         <w:tc>
@@ -1870,7 +2007,7 @@
                 <w:sz w:val="22"/>
                 <w:szCs w:val="22"/>
               </w:rPr>
-              <w:t>Web framework</w:t>
+              <w:t>Model persistence</w:t>
             </w:r>
           </w:p>
         </w:tc>
@@ -1901,7 +2038,7 @@
                 <w:sz w:val="22"/>
                 <w:szCs w:val="22"/>
               </w:rPr>
-              <w:t>Building and deploying the prediction interface for end users</w:t>
+              <w:t>Serializing and loading the trained ensemble model, the scaler, and feature statistics.</w:t>
             </w:r>
           </w:p>
         </w:tc>
@@ -1934,7 +2071,7 @@
                 <w:sz w:val="22"/>
                 <w:szCs w:val="22"/>
               </w:rPr>
-              <w:t>Git and GitHub</w:t>
+              <w:t>Streamlit</w:t>
             </w:r>
           </w:p>
         </w:tc>
@@ -1965,7 +2102,7 @@
                 <w:sz w:val="22"/>
                 <w:szCs w:val="22"/>
               </w:rPr>
-              <w:t>Version control</w:t>
+              <w:t>Web framework</w:t>
             </w:r>
           </w:p>
         </w:tc>
@@ -1996,7 +2133,7 @@
                 <w:sz w:val="22"/>
                 <w:szCs w:val="22"/>
               </w:rPr>
-              <w:t>Tracking code changes and hosting the project repository</w:t>
+              <w:t>Constructing the user interface for real-time dropout risk prediction and academic advice display.</w:t>
             </w:r>
           </w:p>
         </w:tc>
@@ -2029,7 +2166,7 @@
                 <w:sz w:val="22"/>
                 <w:szCs w:val="22"/>
               </w:rPr>
-              <w:t>draw.io</w:t>
+              <w:t>Git and GitHub</w:t>
             </w:r>
           </w:p>
         </w:tc>
@@ -2060,7 +2197,7 @@
                 <w:sz w:val="22"/>
                 <w:szCs w:val="22"/>
               </w:rPr>
-              <w:t>Diagramming tool</w:t>
+              <w:t>Version control</w:t>
             </w:r>
           </w:p>
         </w:tc>
@@ -2091,7 +2228,7 @@
                 <w:sz w:val="22"/>
                 <w:szCs w:val="22"/>
               </w:rPr>
-              <w:t>Drawing the system architecture, flowcharts and UML diagrams</w:t>
+              <w:t>Tracking architectural changes in the code and hosting the project’s source repository.</w:t>
             </w:r>
           </w:p>
         </w:tc>
@@ -2119,21 +2256,12 @@
               <w:spacing w:line="360" w:lineRule="auto"/>
               <w:jc w:val="center"/>
             </w:pPr>
-            <w:proofErr w:type="spellStart"/>
-            <w:r>
-              <w:rPr>
-                <w:sz w:val="22"/>
-                <w:szCs w:val="22"/>
-              </w:rPr>
-              <w:t>Streamlit</w:t>
-            </w:r>
-            <w:proofErr w:type="spellEnd"/>
-            <w:r>
-              <w:rPr>
-                <w:sz w:val="22"/>
-                <w:szCs w:val="22"/>
-              </w:rPr>
-              <w:t xml:space="preserve"> Community Cloud</w:t>
+            <w:r>
+              <w:rPr>
+                <w:sz w:val="22"/>
+                <w:szCs w:val="22"/>
+              </w:rPr>
+              <w:t>draw.io</w:t>
             </w:r>
           </w:p>
         </w:tc>
@@ -2164,6 +2292,102 @@
                 <w:sz w:val="22"/>
                 <w:szCs w:val="22"/>
               </w:rPr>
+              <w:t>Diagramming tool</w:t>
+            </w:r>
+          </w:p>
+        </w:tc>
+        <w:tc>
+          <w:tcPr>
+            <w:tcW w:w="4000" w:type="dxa"/>
+            <w:tcBorders>
+              <w:top w:val="single" w:sz="6" w:space="0" w:color="000000"/>
+              <w:left w:val="single" w:sz="6" w:space="0" w:color="000000"/>
+              <w:bottom w:val="single" w:sz="6" w:space="0" w:color="000000"/>
+              <w:right w:val="single" w:sz="6" w:space="0" w:color="000000"/>
+            </w:tcBorders>
+            <w:tcMar>
+              <w:top w:w="80" w:type="dxa"/>
+              <w:left w:w="120" w:type="dxa"/>
+              <w:bottom w:w="80" w:type="dxa"/>
+              <w:right w:w="120" w:type="dxa"/>
+            </w:tcMar>
+            <w:vAlign w:val="center"/>
+          </w:tcPr>
+          <w:p>
+            <w:pPr>
+              <w:spacing w:line="360" w:lineRule="auto"/>
+              <w:jc w:val="center"/>
+            </w:pPr>
+            <w:r>
+              <w:rPr>
+                <w:sz w:val="22"/>
+                <w:szCs w:val="22"/>
+              </w:rPr>
+              <w:t>Designing technical illustrations including System Architecture, Use Case, and Methodology flowcharts.</w:t>
+            </w:r>
+          </w:p>
+        </w:tc>
+      </w:tr>
+      <w:tr>
+        <w:tc>
+          <w:tcPr>
+            <w:tcW w:w="2500" w:type="dxa"/>
+            <w:tcBorders>
+              <w:top w:val="single" w:sz="6" w:space="0" w:color="000000"/>
+              <w:left w:val="single" w:sz="6" w:space="0" w:color="000000"/>
+              <w:bottom w:val="single" w:sz="6" w:space="0" w:color="000000"/>
+              <w:right w:val="single" w:sz="6" w:space="0" w:color="000000"/>
+            </w:tcBorders>
+            <w:tcMar>
+              <w:top w:w="80" w:type="dxa"/>
+              <w:left w:w="120" w:type="dxa"/>
+              <w:bottom w:w="80" w:type="dxa"/>
+              <w:right w:w="120" w:type="dxa"/>
+            </w:tcMar>
+            <w:vAlign w:val="center"/>
+          </w:tcPr>
+          <w:p>
+            <w:pPr>
+              <w:spacing w:line="360" w:lineRule="auto"/>
+              <w:jc w:val="center"/>
+            </w:pPr>
+            <w:r>
+              <w:rPr>
+                <w:sz w:val="22"/>
+                <w:szCs w:val="22"/>
+              </w:rPr>
+              <w:lastRenderedPageBreak/>
+              <w:t>Streamlit Community Cloud</w:t>
+            </w:r>
+          </w:p>
+        </w:tc>
+        <w:tc>
+          <w:tcPr>
+            <w:tcW w:w="2500" w:type="dxa"/>
+            <w:tcBorders>
+              <w:top w:val="single" w:sz="6" w:space="0" w:color="000000"/>
+              <w:left w:val="single" w:sz="6" w:space="0" w:color="000000"/>
+              <w:bottom w:val="single" w:sz="6" w:space="0" w:color="000000"/>
+              <w:right w:val="single" w:sz="6" w:space="0" w:color="000000"/>
+            </w:tcBorders>
+            <w:tcMar>
+              <w:top w:w="80" w:type="dxa"/>
+              <w:left w:w="120" w:type="dxa"/>
+              <w:bottom w:w="80" w:type="dxa"/>
+              <w:right w:w="120" w:type="dxa"/>
+            </w:tcMar>
+            <w:vAlign w:val="center"/>
+          </w:tcPr>
+          <w:p>
+            <w:pPr>
+              <w:spacing w:line="360" w:lineRule="auto"/>
+              <w:jc w:val="center"/>
+            </w:pPr>
+            <w:r>
+              <w:rPr>
+                <w:sz w:val="22"/>
+                <w:szCs w:val="22"/>
+              </w:rPr>
               <w:t>Hosting platform</w:t>
             </w:r>
           </w:p>
@@ -2195,7 +2419,7 @@
                 <w:sz w:val="22"/>
                 <w:szCs w:val="22"/>
               </w:rPr>
-              <w:t>Free deployment of the finished web application for public access</w:t>
+              <w:t>Cloud-based hosting for public access to the completed dropout prediction system.</w:t>
             </w:r>
           </w:p>
         </w:tc>
@@ -2236,19 +2460,68 @@
     </w:p>
     <w:p>
       <w:pPr>
-        <w:spacing w:before="120" w:after="120" w:line="360" w:lineRule="auto"/>
-      </w:pPr>
-      <w:r>
-        <w:lastRenderedPageBreak/>
-        <w:t>The project will follow a workflow inspired by the Knowledge Discovery in Databases (KDD) process, adapted for the dropout prediction task. A similar staged approach has been used in earlier dropout prediction approaches and has proved effective for handling messy real-world educational data (Nicoletti &amp; de Oliveira, 2020). The steps are described below.</w:t>
-      </w:r>
-    </w:p>
-    <w:p>
-      <w:pPr>
-        <w:pStyle w:val="ListParagraph"/>
+        <w:spacing w:before="120" w:after="240" w:line="360" w:lineRule="auto"/>
+        <w:jc w:val="both"/>
+      </w:pPr>
+      <w:r>
+        <w:t xml:space="preserve">The project </w:t>
+      </w:r>
+      <w:r>
+        <w:rPr>
+          <w:b/>
+          <w:bCs/>
+        </w:rPr>
+        <w:t>will follow</w:t>
+      </w:r>
+      <w:r>
+        <w:t xml:space="preserve"> a workflow inspired by the Knowledge Discovery in Databases (KDD) process, which </w:t>
+      </w:r>
+      <w:r>
+        <w:rPr>
+          <w:b/>
+          <w:bCs/>
+        </w:rPr>
+        <w:t>will be adapted</w:t>
+      </w:r>
+      <w:r>
+        <w:t xml:space="preserve"> for the ensemble dropout prediction task. This staged approach </w:t>
+      </w:r>
+      <w:r>
+        <w:rPr>
+          <w:b/>
+          <w:bCs/>
+        </w:rPr>
+        <w:t>will be utilized</w:t>
+      </w:r>
+      <w:r>
+        <w:t xml:space="preserve"> to handle the complexity of educational data and improve model generalization </w:t>
+      </w:r>
+      <w:r>
+        <w:rPr>
+          <w:b/>
+          <w:bCs/>
+        </w:rPr>
+        <w:t>(Nicoletti &amp; de Oliveira, 2020; Pecuchova &amp; Drlik, 2023)</w:t>
+      </w:r>
+      <w:r>
+        <w:t xml:space="preserve">. The specific steps </w:t>
+      </w:r>
+      <w:r>
+        <w:rPr>
+          <w:b/>
+          <w:bCs/>
+        </w:rPr>
+        <w:t>are described</w:t>
+      </w:r>
+      <w:r>
+        <w:t xml:space="preserve"> below:</w:t>
+      </w:r>
+    </w:p>
+    <w:p>
+      <w:pPr>
         <w:numPr>
           <w:ilvl w:val="0"/>
-          <w:numId w:val="5"/>
+          <w:numId w:val="9"/>
         </w:numPr>
         <w:spacing w:before="120" w:after="240" w:line="360" w:lineRule="auto"/>
         <w:jc w:val="both"/>
@@ -2258,26 +2531,57 @@
           <w:b/>
           <w:bCs/>
         </w:rPr>
-        <w:t>Data collection and preparation</w:t>
-      </w:r>
-      <w:r>
-        <w:t>. The project will use the publicly available "Predict Students' Dropout and Academic Success" dataset from the UCI Machine Learning Repository as its base, since collecting a fresh dataset from a Nigerian university within the project period is difficult due to data privacy rules and the bureaucratic approval processes typical of most Nigerian university registries. Indeed, the limited availability of public student datasets in developing countries has been identified by previous researchers as one of the major obstacles to ML research in African education (</w:t>
-      </w:r>
-      <w:proofErr w:type="spellStart"/>
-      <w:r>
-        <w:t>Mduma</w:t>
-      </w:r>
-      <w:proofErr w:type="spellEnd"/>
-      <w:r>
-        <w:t xml:space="preserve"> et al., 2019). The dataset contains over 4,400 student records with 35 attributes covering demographic, socio-economic and academic features (Jiménez et al., 2023; Villar &amp; Velini de Andrade, 2024). To make the system more relevant to the Nigerian context, the user-facing web form will translate the original set of feature labels into Nigerian equivalents (for example, JAMB instead of the Portuguese national entrance exam) before mapping them back to the model's expected codes.</w:t>
-      </w:r>
-    </w:p>
-    <w:p>
-      <w:pPr>
-        <w:pStyle w:val="ListParagraph"/>
+        <w:t>Data collection and preparation.</w:t>
+      </w:r>
+      <w:r>
+        <w:t xml:space="preserve"> The project </w:t>
+      </w:r>
+      <w:r>
+        <w:rPr>
+          <w:b/>
+          <w:bCs/>
+        </w:rPr>
+        <w:t>will use</w:t>
+      </w:r>
+      <w:r>
+        <w:t xml:space="preserve"> the UCI "Predict Students' Dropout and Academic Success" dataset as a benchmark due to local data privacy constraints </w:t>
+      </w:r>
+      <w:r>
+        <w:rPr>
+          <w:b/>
+          <w:bCs/>
+        </w:rPr>
+        <w:t>(Mduma et al., 2019; Villar &amp; de Andrade, 2024)</w:t>
+      </w:r>
+      <w:r>
+        <w:t xml:space="preserve">. To ensure relevance, the system </w:t>
+      </w:r>
+      <w:r>
+        <w:rPr>
+          <w:b/>
+          <w:bCs/>
+        </w:rPr>
+        <w:t>will map</w:t>
+      </w:r>
+      <w:r>
+        <w:t xml:space="preserve"> original features to Nigerian equivalents—such as UTME/JAMB for entrance exams and SSCE/WAEC for previous qualifications—using custom dictionary mappings </w:t>
+      </w:r>
+      <w:r>
+        <w:rPr>
+          <w:b/>
+          <w:bCs/>
+        </w:rPr>
+        <w:t>(Jiménez et al., 2023)</w:t>
+      </w:r>
+      <w:r>
+        <w:t>.</w:t>
+      </w:r>
+    </w:p>
+    <w:p>
+      <w:pPr>
         <w:numPr>
           <w:ilvl w:val="0"/>
-          <w:numId w:val="5"/>
+          <w:numId w:val="9"/>
         </w:numPr>
         <w:spacing w:before="120" w:after="240" w:line="360" w:lineRule="auto"/>
         <w:jc w:val="both"/>
@@ -2287,18 +2591,77 @@
           <w:b/>
           <w:bCs/>
         </w:rPr>
-        <w:t>Data cleaning</w:t>
-      </w:r>
-      <w:r>
-        <w:t>. The raw dataset will be checked for duplicate rows, missing values and outliers. As pointed out by Nicoletti and de Oliveira (2020), proper preprocessing is essential because instance-based and other learning algorithms are very sensitive to noisy data and irrelevant attributes (Villar &amp; Velini de Andrade, 2024). The ambiguous "Enrolled" class, which represents students who were still studying when the data was collected, will be removed so that the problem becomes a clean binary classification of Dropout versus Graduate. Outliers in the "Age at enrolment" column will be trimmed at the first and ninety-ninth percentiles to avoid distortion.</w:t>
-      </w:r>
-    </w:p>
-    <w:p>
-      <w:pPr>
-        <w:pStyle w:val="ListParagraph"/>
+        <w:t>Data cleaning.</w:t>
+      </w:r>
+      <w:r>
+        <w:t xml:space="preserve"> The raw data </w:t>
+      </w:r>
+      <w:r>
+        <w:rPr>
+          <w:b/>
+          <w:bCs/>
+        </w:rPr>
+        <w:t>will be checked</w:t>
+      </w:r>
+      <w:r>
+        <w:t xml:space="preserve"> for missing values and duplicates. The "Enrolled" class </w:t>
+      </w:r>
+      <w:r>
+        <w:rPr>
+          <w:b/>
+          <w:bCs/>
+        </w:rPr>
+        <w:t>will be removed</w:t>
+      </w:r>
+      <w:r>
+        <w:t xml:space="preserve"> to facilitate a clear binary classification (Graduate vs. Dropout) </w:t>
+      </w:r>
+      <w:r>
+        <w:rPr>
+          <w:b/>
+          <w:bCs/>
+        </w:rPr>
+        <w:t>(Villar &amp; de Andrade, 2024)</w:t>
+      </w:r>
+      <w:r>
+        <w:t xml:space="preserve">. Crucially, to solve the "Accuracy Paradox" common in imbalanced educational datasets, the </w:t>
+      </w:r>
+      <w:r>
+        <w:rPr>
+          <w:b/>
+          <w:bCs/>
+        </w:rPr>
+        <w:t>Synthetic Minority Over-sampling Technique (SMOTE)</w:t>
+      </w:r>
+      <w:r>
+        <w:t xml:space="preserve"> </w:t>
+      </w:r>
+      <w:r>
+        <w:rPr>
+          <w:b/>
+          <w:bCs/>
+        </w:rPr>
+        <w:t>will be applied</w:t>
+      </w:r>
+      <w:r>
+        <w:t xml:space="preserve"> to the training set to ensure the model does not become biased toward the majority class </w:t>
+      </w:r>
+      <w:r>
+        <w:rPr>
+          <w:b/>
+          <w:bCs/>
+        </w:rPr>
+        <w:t>(Arifudin et al., 2026; Niyogisubizo et al., 2022)</w:t>
+      </w:r>
+      <w:r>
+        <w:t>.</w:t>
+      </w:r>
+    </w:p>
+    <w:p>
+      <w:pPr>
         <w:numPr>
           <w:ilvl w:val="0"/>
-          <w:numId w:val="5"/>
+          <w:numId w:val="9"/>
         </w:numPr>
         <w:spacing w:before="120" w:after="240" w:line="360" w:lineRule="auto"/>
         <w:jc w:val="both"/>
@@ -2308,22 +2671,67 @@
           <w:b/>
           <w:bCs/>
         </w:rPr>
-        <w:t>Feature selection</w:t>
-      </w:r>
-      <w:r>
-        <w:t xml:space="preserve">. Mutual Information will be used to score each feature against the target. Features with very low predictive value (a Mutual Information score of 0.01 or less) will be dropped to reduce noise and improve model effectiveness. From early experiments, this is expected to leave around twenty-four useful features out of the first thirty-four. Feature selection techniques such as filter methods are preferred for this kind of work because they are computationally very cheap and </w:t>
-      </w:r>
-      <w:r>
-        <w:lastRenderedPageBreak/>
-        <w:t>can handle the mixed data types found inside educational datasets (Nicoletti &amp; de Oliveira, 2020; Jiménez et al., 2023).</w:t>
-      </w:r>
-    </w:p>
-    <w:p>
-      <w:pPr>
-        <w:pStyle w:val="ListParagraph"/>
+        <w:t>Feature selection.</w:t>
+      </w:r>
+      <w:r>
+        <w:t xml:space="preserve"> </w:t>
+      </w:r>
+      <w:r>
+        <w:rPr>
+          <w:b/>
+          <w:bCs/>
+        </w:rPr>
+        <w:t>Mutual Information (MI)</w:t>
+      </w:r>
+      <w:r>
+        <w:t xml:space="preserve"> </w:t>
+      </w:r>
+      <w:r>
+        <w:rPr>
+          <w:b/>
+          <w:bCs/>
+        </w:rPr>
+        <w:t>will be used</w:t>
+      </w:r>
+      <w:r>
+        <w:t xml:space="preserve"> to quantify the dependency between variables and the target. This filter-based method </w:t>
+      </w:r>
+      <w:r>
+        <w:rPr>
+          <w:b/>
+          <w:bCs/>
+        </w:rPr>
+        <w:t>is preferred</w:t>
+      </w:r>
+      <w:r>
+        <w:t xml:space="preserve"> for its computational efficiency and ability to capture non-linear relationships </w:t>
+      </w:r>
+      <w:r>
+        <w:rPr>
+          <w:b/>
+          <w:bCs/>
+        </w:rPr>
+        <w:t>(Naseem et al., 2021; Ardabili et al., 2019)</w:t>
+      </w:r>
+      <w:r>
+        <w:t xml:space="preserve">. From early tests, the top 24 features </w:t>
+      </w:r>
+      <w:r>
+        <w:rPr>
+          <w:b/>
+          <w:bCs/>
+        </w:rPr>
+        <w:t>will be selected</w:t>
+      </w:r>
+      <w:r>
+        <w:t xml:space="preserve"> to reduce noise and optimize training time.</w:t>
+      </w:r>
+    </w:p>
+    <w:p>
+      <w:pPr>
         <w:numPr>
           <w:ilvl w:val="0"/>
-          <w:numId w:val="5"/>
+          <w:numId w:val="9"/>
         </w:numPr>
         <w:spacing w:before="120" w:after="240" w:line="360" w:lineRule="auto"/>
         <w:jc w:val="both"/>
@@ -2333,34 +2741,47 @@
           <w:b/>
           <w:bCs/>
         </w:rPr>
-        <w:t>Model training and validation</w:t>
-      </w:r>
-      <w:r>
-        <w:t xml:space="preserve">. Three classifiers will be trained on the cleaned data: Logistic Regression as a linear baseline, Random Forest as a non-linear ensemble method, and Support Vector Machine as a kernel-based approach (Fatima et al., 2023; </w:t>
-      </w:r>
-      <w:proofErr w:type="spellStart"/>
-      <w:r>
-        <w:t>Valkenborg</w:t>
-      </w:r>
-      <w:proofErr w:type="spellEnd"/>
-      <w:r>
-        <w:t xml:space="preserve"> et al., 2023). Choosing models from three different families allows a fair comparison across algorithm types instead of just within one family. This kind of multi-model comparison is consistent with the approach used in previous studies, where six or more classifiers are typically trained and the best one selected on the basis of the evaluation metrics (Hassan et al., 2024; Jiménez et al., 2023; </w:t>
-      </w:r>
-      <w:proofErr w:type="spellStart"/>
-      <w:r>
-        <w:t>Osemwegie</w:t>
-      </w:r>
-      <w:proofErr w:type="spellEnd"/>
-      <w:r>
-        <w:t xml:space="preserve"> &amp; Amadin, 2023). Each model will be trained on eighty percent of the data and tested on the remaining twenty percent, with stratified five-fold cross-validation applied to the training set to check for stability and overfitting.</w:t>
-      </w:r>
-    </w:p>
-    <w:p>
-      <w:pPr>
-        <w:pStyle w:val="ListParagraph"/>
+        <w:t>Ensemble training and validation.</w:t>
+      </w:r>
+      <w:r>
+        <w:t xml:space="preserve"> A </w:t>
+      </w:r>
+      <w:r>
+        <w:rPr>
+          <w:b/>
+          <w:bCs/>
+        </w:rPr>
+        <w:t>Two-Level Stacking Ensemble</w:t>
+      </w:r>
+      <w:r>
+        <w:t xml:space="preserve"> </w:t>
+      </w:r>
+      <w:r>
+        <w:rPr>
+          <w:b/>
+          <w:bCs/>
+        </w:rPr>
+        <w:t>will be developed</w:t>
+      </w:r>
+      <w:r>
+        <w:t xml:space="preserve"> </w:t>
+      </w:r>
+      <w:r>
+        <w:rPr>
+          <w:b/>
+          <w:bCs/>
+        </w:rPr>
+        <w:t>(Niyogisubizo et al., 2022)</w:t>
+      </w:r>
+      <w:r>
+        <w:t>.</w:t>
+      </w:r>
+    </w:p>
+    <w:p>
+      <w:pPr>
         <w:numPr>
-          <w:ilvl w:val="0"/>
-          <w:numId w:val="5"/>
+          <w:ilvl w:val="1"/>
+          <w:numId w:val="10"/>
         </w:numPr>
         <w:spacing w:before="120" w:after="240" w:line="360" w:lineRule="auto"/>
         <w:jc w:val="both"/>
@@ -2370,26 +2791,38 @@
           <w:b/>
           <w:bCs/>
         </w:rPr>
-        <w:t>Evaluation</w:t>
-      </w:r>
-      <w:r>
-        <w:t xml:space="preserve">. The performance of the three models will be measured using accuracy, precision, recall, F1-score and ROC-AUC (Fatima et al., 2023). Confusion matrices and ROC curves will also be plotted for visual comparison. The best-performing model will be selected mainly on the basis of ROC-AUC and recall, because in a dropout-intervention setting, missing a student who is actually at risk is more costly than raising a false alarm (Bashiru &amp; </w:t>
-      </w:r>
-      <w:proofErr w:type="spellStart"/>
-      <w:r>
-        <w:t>Malgwi</w:t>
-      </w:r>
-      <w:proofErr w:type="spellEnd"/>
-      <w:r>
-        <w:t>, 2026; Villar &amp; Velini de Andrade, 2024). The selected model will then be saved for deployment.</w:t>
-      </w:r>
-    </w:p>
-    <w:p>
-      <w:pPr>
-        <w:pStyle w:val="ListParagraph"/>
+        <w:lastRenderedPageBreak/>
+        <w:t>Level 0 (Base Learners):</w:t>
+      </w:r>
+      <w:r>
+        <w:t xml:space="preserve"> Logistic Regression, Random Forest (300 trees), and SVM (RBF kernel) </w:t>
+      </w:r>
+      <w:r>
+        <w:rPr>
+          <w:b/>
+          <w:bCs/>
+        </w:rPr>
+        <w:t>will be trained</w:t>
+      </w:r>
+      <w:r>
+        <w:t xml:space="preserve"> to capture diverse patterns in the data </w:t>
+      </w:r>
+      <w:r>
+        <w:rPr>
+          <w:b/>
+          <w:bCs/>
+        </w:rPr>
+        <w:t>(Fatima et al., 2023; Valkenborg et al., 2023)</w:t>
+      </w:r>
+      <w:r>
+        <w:t>.</w:t>
+      </w:r>
+    </w:p>
+    <w:p>
+      <w:pPr>
         <w:numPr>
-          <w:ilvl w:val="0"/>
-          <w:numId w:val="5"/>
+          <w:ilvl w:val="1"/>
+          <w:numId w:val="10"/>
         </w:numPr>
         <w:spacing w:before="120" w:after="240" w:line="360" w:lineRule="auto"/>
         <w:jc w:val="both"/>
@@ -2399,42 +2832,47 @@
           <w:b/>
           <w:bCs/>
         </w:rPr>
-        <w:t>Deployment</w:t>
-      </w:r>
-      <w:r>
-        <w:t xml:space="preserve">. The selected model will be wrapped in a </w:t>
-      </w:r>
-      <w:proofErr w:type="spellStart"/>
-      <w:r>
-        <w:t>Streamlit</w:t>
-      </w:r>
-      <w:proofErr w:type="spellEnd"/>
-      <w:r>
-        <w:t xml:space="preserve"> web application. The interface will be </w:t>
-      </w:r>
-      <w:proofErr w:type="spellStart"/>
-      <w:r>
-        <w:t>organised</w:t>
-      </w:r>
-      <w:proofErr w:type="spellEnd"/>
-      <w:r>
-        <w:t xml:space="preserve"> into seven sections: personal information, educational background, family background, financial status, first semester performance, second semester performance and economic context. Users will pick options from dropdowns rather than typing numeric codes, which makes the form usable for people with no technical background (Zhao &amp; Ren, 2025). The app will be hosted free on </w:t>
-      </w:r>
-      <w:proofErr w:type="spellStart"/>
-      <w:r>
-        <w:t>Streamlit</w:t>
-      </w:r>
-      <w:proofErr w:type="spellEnd"/>
-      <w:r>
-        <w:t xml:space="preserve"> Community Cloud and the code will be maintained on GitHub for version control and easy sharing.</w:t>
-      </w:r>
-    </w:p>
-    <w:p>
-      <w:pPr>
-        <w:pStyle w:val="ListParagraph"/>
+        <w:t>Level 1 (Meta-Learner):</w:t>
+      </w:r>
+      <w:r>
+        <w:t xml:space="preserve"> A Logistic Regression meta-model </w:t>
+      </w:r>
+      <w:r>
+        <w:rPr>
+          <w:b/>
+          <w:bCs/>
+        </w:rPr>
+        <w:t>will be implemented</w:t>
+      </w:r>
+      <w:r>
+        <w:t xml:space="preserve"> to synthesize the base learners' probabilities into a final prediction. Stratified five-fold cross-validation </w:t>
+      </w:r>
+      <w:r>
+        <w:rPr>
+          <w:b/>
+          <w:bCs/>
+        </w:rPr>
+        <w:t>will be applied</w:t>
+      </w:r>
+      <w:r>
+        <w:t xml:space="preserve"> to the training set to prevent overfitting </w:t>
+      </w:r>
+      <w:r>
+        <w:rPr>
+          <w:b/>
+          <w:bCs/>
+        </w:rPr>
+        <w:t>(Pecuchova &amp; Drlik, 2023)</w:t>
+      </w:r>
+      <w:r>
+        <w:t>.</w:t>
+      </w:r>
+    </w:p>
+    <w:p>
+      <w:pPr>
         <w:numPr>
           <w:ilvl w:val="0"/>
-          <w:numId w:val="5"/>
+          <w:numId w:val="9"/>
         </w:numPr>
         <w:spacing w:before="120" w:after="240" w:line="360" w:lineRule="auto"/>
         <w:jc w:val="both"/>
@@ -2444,10 +2882,170 @@
           <w:b/>
           <w:bCs/>
         </w:rPr>
-        <w:t>Documentation and reporting</w:t>
-      </w:r>
-      <w:r>
-        <w:t>. All steps, decisions, results and limitations will be documented in the final project report following the departmental guidelines. The source code, trained models, datasets and screenshots will be uploaded to a public GitHub repository for reproducibility along with future reference.</w:t>
+        <w:t>Evaluation.</w:t>
+      </w:r>
+      <w:r>
+        <w:t xml:space="preserve"> The ensemble’s performance </w:t>
+      </w:r>
+      <w:r>
+        <w:rPr>
+          <w:b/>
+          <w:bCs/>
+        </w:rPr>
+        <w:t>will be measured</w:t>
+      </w:r>
+      <w:r>
+        <w:t xml:space="preserve"> using accuracy, precision, recall, F1-score, and </w:t>
+      </w:r>
+      <w:r>
+        <w:rPr>
+          <w:b/>
+          <w:bCs/>
+        </w:rPr>
+        <w:t>ROC-AUC</w:t>
+      </w:r>
+      <w:r>
+        <w:t xml:space="preserve"> </w:t>
+      </w:r>
+      <w:r>
+        <w:rPr>
+          <w:b/>
+          <w:bCs/>
+        </w:rPr>
+        <w:t>(Fatima et al., 2023)</w:t>
+      </w:r>
+      <w:r>
+        <w:t xml:space="preserve">. The best model </w:t>
+      </w:r>
+      <w:r>
+        <w:rPr>
+          <w:b/>
+          <w:bCs/>
+        </w:rPr>
+        <w:t>will be selected</w:t>
+      </w:r>
+      <w:r>
+        <w:t xml:space="preserve"> based on ROC-AUC and Recall, as failing to identify an at-risk student is more critical than a false alarm in an intervention setting </w:t>
+      </w:r>
+      <w:r>
+        <w:rPr>
+          <w:b/>
+          <w:bCs/>
+        </w:rPr>
+        <w:t>(Bashiru &amp; Malgwi, 2026; Arifudin et al., 2026)</w:t>
+      </w:r>
+      <w:r>
+        <w:t>.</w:t>
+      </w:r>
+    </w:p>
+    <w:p>
+      <w:pPr>
+        <w:numPr>
+          <w:ilvl w:val="0"/>
+          <w:numId w:val="9"/>
+        </w:numPr>
+        <w:spacing w:before="120" w:after="240" w:line="360" w:lineRule="auto"/>
+        <w:jc w:val="both"/>
+      </w:pPr>
+      <w:r>
+        <w:rPr>
+          <w:b/>
+          <w:bCs/>
+        </w:rPr>
+        <w:t>Deployment.</w:t>
+      </w:r>
+      <w:r>
+        <w:t xml:space="preserve"> The final ensemble </w:t>
+      </w:r>
+      <w:r>
+        <w:rPr>
+          <w:b/>
+          <w:bCs/>
+        </w:rPr>
+        <w:t>will be wrapped</w:t>
+      </w:r>
+      <w:r>
+        <w:t xml:space="preserve"> in a </w:t>
+      </w:r>
+      <w:r>
+        <w:rPr>
+          <w:b/>
+          <w:bCs/>
+        </w:rPr>
+        <w:t>Streamlit</w:t>
+      </w:r>
+      <w:r>
+        <w:t xml:space="preserve"> web application. The interface </w:t>
+      </w:r>
+      <w:r>
+        <w:rPr>
+          <w:b/>
+          <w:bCs/>
+        </w:rPr>
+        <w:t>will be organized</w:t>
+      </w:r>
+      <w:r>
+        <w:t xml:space="preserve"> into seven sections: personal, educational, family, financial, 1st and 2nd semester performance, and economic context. Dropdowns </w:t>
+      </w:r>
+      <w:r>
+        <w:rPr>
+          <w:b/>
+          <w:bCs/>
+        </w:rPr>
+        <w:t>will be used</w:t>
+      </w:r>
+      <w:r>
+        <w:t xml:space="preserve"> to ensure the system is usable for non-technical university staff </w:t>
+      </w:r>
+      <w:r>
+        <w:rPr>
+          <w:b/>
+          <w:bCs/>
+        </w:rPr>
+        <w:t>(Zhao &amp; Ren, 2025)</w:t>
+      </w:r>
+      <w:r>
+        <w:t>.</w:t>
+      </w:r>
+    </w:p>
+    <w:p>
+      <w:pPr>
+        <w:numPr>
+          <w:ilvl w:val="0"/>
+          <w:numId w:val="9"/>
+        </w:numPr>
+        <w:spacing w:before="120" w:after="240" w:line="360" w:lineRule="auto"/>
+        <w:jc w:val="both"/>
+      </w:pPr>
+      <w:r>
+        <w:rPr>
+          <w:b/>
+          <w:bCs/>
+        </w:rPr>
+        <w:t>Documentation and reporting.</w:t>
+      </w:r>
+      <w:r>
+        <w:t xml:space="preserve"> All architectural decisions, performance metrics, and visualizations—including ROC curves and MI score charts—</w:t>
+      </w:r>
+      <w:r>
+        <w:rPr>
+          <w:b/>
+          <w:bCs/>
+        </w:rPr>
+        <w:t>will be documented</w:t>
+      </w:r>
+      <w:r>
+        <w:t xml:space="preserve"> in the final report. The code </w:t>
+      </w:r>
+      <w:r>
+        <w:rPr>
+          <w:b/>
+          <w:bCs/>
+        </w:rPr>
+        <w:t>will be uploaded</w:t>
+      </w:r>
+      <w:r>
+        <w:t xml:space="preserve"> to GitHub for reproducibility.</w:t>
       </w:r>
     </w:p>
     <w:p>
@@ -2457,14 +3055,28 @@
       </w:pPr>
       <w:r>
         <w:rPr>
+          <w:b/>
+          <w:bCs/>
+          <w:i/>
+          <w:iCs/>
           <w:noProof/>
+          <w:sz w:val="22"/>
+          <w:szCs w:val="22"/>
         </w:rPr>
         <w:lastRenderedPageBreak/>
         <w:drawing>
-          <wp:inline distT="0" distB="0" distL="0" distR="0" wp14:anchorId="17E33A3C" wp14:editId="4A72BB39">
-            <wp:extent cx="5502910" cy="5835650"/>
-            <wp:effectExtent l="0" t="0" r="2540" b="0"/>
-            <wp:docPr id="373309943" name="Picture 1"/>
+          <wp:anchor distT="0" distB="0" distL="114300" distR="114300" simplePos="0" relativeHeight="251659264" behindDoc="0" locked="0" layoutInCell="1" allowOverlap="1" wp14:anchorId="5035786B" wp14:editId="3D0FC150">
+            <wp:simplePos x="0" y="0"/>
+            <wp:positionH relativeFrom="margin">
+              <wp:posOffset>-466090</wp:posOffset>
+            </wp:positionH>
+            <wp:positionV relativeFrom="margin">
+              <wp:posOffset>0</wp:posOffset>
+            </wp:positionV>
+            <wp:extent cx="6235702" cy="3404234"/>
+            <wp:effectExtent l="0" t="0" r="0" b="6350"/>
+            <wp:wrapSquare wrapText="bothSides"/>
+            <wp:docPr id="1063399781" name="Picture 1"/>
             <wp:cNvGraphicFramePr>
               <a:graphicFrameLocks xmlns:a="http://schemas.openxmlformats.org/drawingml/2006/main" noChangeAspect="1"/>
             </wp:cNvGraphicFramePr>
@@ -2472,10 +3084,8 @@
               <a:graphicData uri="http://schemas.openxmlformats.org/drawingml/2006/picture">
                 <pic:pic xmlns:pic="http://schemas.openxmlformats.org/drawingml/2006/picture">
                   <pic:nvPicPr>
-                    <pic:cNvPr id="0" name="Picture 1"/>
-                    <pic:cNvPicPr>
-                      <a:picLocks noChangeAspect="1" noChangeArrowheads="1"/>
-                    </pic:cNvPicPr>
+                    <pic:cNvPr id="1063399781" name=""/>
+                    <pic:cNvPicPr/>
                   </pic:nvPicPr>
                   <pic:blipFill>
                     <a:blip r:embed="rId10">
@@ -2485,28 +3095,23 @@
                         </a:ext>
                       </a:extLst>
                     </a:blip>
-                    <a:srcRect/>
                     <a:stretch>
                       <a:fillRect/>
                     </a:stretch>
                   </pic:blipFill>
-                  <pic:spPr bwMode="auto">
+                  <pic:spPr>
                     <a:xfrm>
                       <a:off x="0" y="0"/>
-                      <a:ext cx="5502910" cy="5835650"/>
+                      <a:ext cx="6235702" cy="3404234"/>
                     </a:xfrm>
                     <a:prstGeom prst="rect">
                       <a:avLst/>
                     </a:prstGeom>
-                    <a:noFill/>
-                    <a:ln>
-                      <a:noFill/>
-                    </a:ln>
                   </pic:spPr>
                 </pic:pic>
               </a:graphicData>
             </a:graphic>
-          </wp:inline>
+          </wp:anchor>
         </w:drawing>
       </w:r>
       <w:r>
@@ -2518,7 +3123,29 @@
           <w:sz w:val="22"/>
           <w:szCs w:val="22"/>
         </w:rPr>
-        <w:t>Figure 5.3: Flowchart of the Project Methodology</w:t>
+        <w:t>Figure 5.3: Flowchart of the</w:t>
+      </w:r>
+      <w:r>
+        <w:rPr>
+          <w:b/>
+          <w:bCs/>
+          <w:i/>
+          <w:iCs/>
+          <w:sz w:val="22"/>
+          <w:szCs w:val="22"/>
+        </w:rPr>
+        <w:t xml:space="preserve"> Stacking Ensemble</w:t>
+      </w:r>
+      <w:r>
+        <w:rPr>
+          <w:b/>
+          <w:bCs/>
+          <w:i/>
+          <w:iCs/>
+          <w:sz w:val="22"/>
+          <w:szCs w:val="22"/>
+        </w:rPr>
+        <w:t xml:space="preserve"> Methodology</w:t>
       </w:r>
     </w:p>
     <w:p>
@@ -2560,162 +3187,116 @@
     </w:p>
     <w:p>
       <w:pPr>
-        <w:pStyle w:val="ListParagraph"/>
         <w:numPr>
           <w:ilvl w:val="0"/>
-          <w:numId w:val="6"/>
+          <w:numId w:val="12"/>
         </w:numPr>
         <w:spacing w:before="120" w:after="120" w:line="360" w:lineRule="auto"/>
       </w:pPr>
       <w:r>
-        <w:t xml:space="preserve">A cleaned and properly preprocessed dataset suitable for dropout prediction, with all noisy and irrelevant features removed </w:t>
-      </w:r>
-      <w:r>
-        <w:rPr>
-          <w:b/>
-          <w:bCs/>
-        </w:rPr>
-        <w:t>(Jiménez et al., 2023; Villar &amp; Velini de Andrade, 2024)</w:t>
-      </w:r>
-      <w:r>
-        <w:t>.</w:t>
-      </w:r>
-    </w:p>
-    <w:p>
-      <w:pPr>
-        <w:pStyle w:val="ListParagraph"/>
+        <w:rPr>
+          <w:b/>
+          <w:bCs/>
+        </w:rPr>
+        <w:t>A cleaned and optimized student dataset</w:t>
+      </w:r>
+      <w:r>
+        <w:t xml:space="preserve"> consisting of a prioritized subset of variables identified through the application of Mutual Information feature selection.</w:t>
+      </w:r>
+    </w:p>
+    <w:p>
+      <w:pPr>
         <w:numPr>
           <w:ilvl w:val="0"/>
-          <w:numId w:val="7"/>
+          <w:numId w:val="12"/>
         </w:numPr>
         <w:spacing w:before="120" w:after="120" w:line="360" w:lineRule="auto"/>
       </w:pPr>
       <w:r>
-        <w:t xml:space="preserve">Three trained machine learning models (Logistic Regression, Random Forest along with Support Vector Machine) along with a clear comparison of the performance using standard classification metrics </w:t>
-      </w:r>
-      <w:r>
-        <w:rPr>
-          <w:b/>
-          <w:bCs/>
-        </w:rPr>
-        <w:t xml:space="preserve">(Fatima et al., 2023; </w:t>
-      </w:r>
-      <w:proofErr w:type="spellStart"/>
-      <w:r>
-        <w:rPr>
-          <w:b/>
-          <w:bCs/>
-        </w:rPr>
-        <w:t>Valkenborg</w:t>
-      </w:r>
-      <w:proofErr w:type="spellEnd"/>
-      <w:r>
-        <w:rPr>
-          <w:b/>
-          <w:bCs/>
-        </w:rPr>
-        <w:t xml:space="preserve"> et al., 2023)</w:t>
-      </w:r>
-      <w:r>
-        <w:t>.</w:t>
-      </w:r>
-    </w:p>
-    <w:p>
-      <w:pPr>
-        <w:pStyle w:val="ListParagraph"/>
+        <w:rPr>
+          <w:b/>
+          <w:bCs/>
+        </w:rPr>
+        <w:t>A comparative performance analysis</w:t>
+      </w:r>
+      <w:r>
+        <w:t xml:space="preserve"> documenting the efficiency of individual base learners against the final synthesized Stacking Ensemble architecture.</w:t>
+      </w:r>
+    </w:p>
+    <w:p>
+      <w:pPr>
         <w:numPr>
           <w:ilvl w:val="0"/>
-          <w:numId w:val="7"/>
+          <w:numId w:val="12"/>
         </w:numPr>
         <w:spacing w:before="120" w:after="120" w:line="360" w:lineRule="auto"/>
       </w:pPr>
       <w:r>
-        <w:t xml:space="preserve">A best-performing model with an expected accuracy of at least eighty-five percent and a ROC-AUC score above 0.90. These targets are realistic when judged against the results reported in the literature, where Random Forest models have been found to reach 95% accuracy on similar dropout datasets (Hassan et al., 2024; </w:t>
-      </w:r>
-      <w:r>
-        <w:rPr>
-          <w:b/>
-          <w:bCs/>
-        </w:rPr>
-        <w:t>Jiménez et al., 2023</w:t>
-      </w:r>
-      <w:r>
-        <w:t>), and Logistic Regression has reached close to 99% accuracy on Nigerian university data (</w:t>
-      </w:r>
-      <w:proofErr w:type="spellStart"/>
-      <w:r>
-        <w:t>Osemwegie</w:t>
-      </w:r>
-      <w:proofErr w:type="spellEnd"/>
-      <w:r>
-        <w:t xml:space="preserve"> &amp; Amadin, 2023).</w:t>
-      </w:r>
-    </w:p>
-    <w:p>
-      <w:pPr>
-        <w:pStyle w:val="ListParagraph"/>
+        <w:rPr>
+          <w:b/>
+          <w:bCs/>
+        </w:rPr>
+        <w:t>A high-performance ensemble model</w:t>
+      </w:r>
+      <w:r>
+        <w:t xml:space="preserve"> with an expected accuracy and ROC-AUC score that significantly exceeds the baseline results of standalone algorithms.</w:t>
+      </w:r>
+    </w:p>
+    <w:p>
+      <w:pPr>
         <w:numPr>
           <w:ilvl w:val="0"/>
-          <w:numId w:val="7"/>
+          <w:numId w:val="12"/>
         </w:numPr>
         <w:spacing w:before="120" w:after="120" w:line="360" w:lineRule="auto"/>
       </w:pPr>
       <w:r>
-        <w:t xml:space="preserve">A working </w:t>
-      </w:r>
-      <w:proofErr w:type="spellStart"/>
-      <w:r>
-        <w:t>Streamlit</w:t>
-      </w:r>
-      <w:proofErr w:type="spellEnd"/>
-      <w:r>
-        <w:t xml:space="preserve"> web application that takes student information through a Nigerian-friendly form and returns a dropout-risk prediction in real time </w:t>
-      </w:r>
-      <w:r>
-        <w:rPr>
-          <w:b/>
-          <w:bCs/>
-        </w:rPr>
-        <w:t>(Zhao &amp; Ren, 2025)</w:t>
-      </w:r>
-      <w:r>
-        <w:t>.</w:t>
-      </w:r>
-    </w:p>
-    <w:p>
-      <w:pPr>
-        <w:pStyle w:val="ListParagraph"/>
+        <w:rPr>
+          <w:b/>
+          <w:bCs/>
+        </w:rPr>
+        <w:t>A working Streamlit web application</w:t>
+      </w:r>
+      <w:r>
+        <w:t xml:space="preserve"> designed with a Nigerian-friendly interface to provide real-time dropout risk assessment and automated support recommendations.</w:t>
+      </w:r>
+    </w:p>
+    <w:p>
+      <w:pPr>
         <w:numPr>
           <w:ilvl w:val="0"/>
-          <w:numId w:val="7"/>
+          <w:numId w:val="12"/>
         </w:numPr>
         <w:spacing w:before="120" w:after="120" w:line="360" w:lineRule="auto"/>
       </w:pPr>
       <w:r>
-        <w:t xml:space="preserve">Comparison plots, confusion matrices and a feature-importance chart that explain why the model makes the decisions it does </w:t>
-      </w:r>
-      <w:r>
-        <w:rPr>
-          <w:b/>
-          <w:bCs/>
-        </w:rPr>
-        <w:t>(Fatima et al., 2023; Zhao &amp; Ren, 2025)</w:t>
-      </w:r>
-      <w:r>
-        <w:t>.</w:t>
-      </w:r>
-    </w:p>
-    <w:p>
-      <w:pPr>
-        <w:pStyle w:val="ListParagraph"/>
+        <w:rPr>
+          <w:b/>
+          <w:bCs/>
+        </w:rPr>
+        <w:t>Technical visualizations</w:t>
+      </w:r>
+      <w:r>
+        <w:t xml:space="preserve"> including ROC-AUC curves, confusion matrices, and feature-importance charts that explain the model’s internal decision logic.</w:t>
+      </w:r>
+    </w:p>
+    <w:p>
+      <w:pPr>
         <w:numPr>
           <w:ilvl w:val="0"/>
-          <w:numId w:val="7"/>
+          <w:numId w:val="12"/>
         </w:numPr>
         <w:spacing w:before="120" w:after="120" w:line="360" w:lineRule="auto"/>
       </w:pPr>
       <w:r>
-        <w:t>A complete project report and a public GitHub repository containing all source code, datasets and documentation, so that future students can extend the work.</w:t>
+        <w:rPr>
+          <w:b/>
+          <w:bCs/>
+        </w:rPr>
+        <w:t>A comprehensive final project report</w:t>
+      </w:r>
+      <w:r>
+        <w:t xml:space="preserve"> and a public GitHub repository hosting the complete source code and documentation for future academic extension.</w:t>
       </w:r>
     </w:p>
     <w:p>
@@ -2723,7 +3304,7 @@
         <w:spacing w:before="120" w:after="120" w:line="360" w:lineRule="auto"/>
       </w:pPr>
       <w:r>
-        <w:t>The success of the project will be measured by three things: the correctness and reliability of the final model on the test set, the usability of the deployed web app (which will be tested informally on classmates and a few volunteer students), and the completeness of the documentation.</w:t>
+        <w:t>The success of the project will be measured by three things: the technical reliability of the stacking ensemble on unseen data, the practical usability of the Streamlit application for academic counseling, and the overall completeness of the research documentation.</w:t>
       </w:r>
     </w:p>
     <w:p>
@@ -2760,49 +3341,193 @@
         <w:spacing w:before="120" w:after="120" w:line="360" w:lineRule="auto"/>
       </w:pPr>
       <w:r>
-        <w:t>This project carries both academic as well as practical importance. On the academic side, it adds to the small but growing body of work on educational data mining in African higher institutions, an area that is still under-researched compared to Europe and North America (</w:t>
-      </w:r>
-      <w:proofErr w:type="spellStart"/>
-      <w:r>
-        <w:t>Mduma</w:t>
-      </w:r>
-      <w:proofErr w:type="spellEnd"/>
-      <w:r>
-        <w:t xml:space="preserve"> et al., 2019; </w:t>
-      </w:r>
-      <w:proofErr w:type="spellStart"/>
-      <w:r>
-        <w:t>Mukooyo</w:t>
-      </w:r>
-      <w:proofErr w:type="spellEnd"/>
-      <w:r>
-        <w:t xml:space="preserve"> &amp; Kasse, 2024). It additionally builds on earlier Nigerian work in this space, such as the hybrid model developed by </w:t>
-      </w:r>
-      <w:proofErr w:type="spellStart"/>
-      <w:r>
-        <w:t>Alarape</w:t>
-      </w:r>
-      <w:proofErr w:type="spellEnd"/>
-      <w:r>
-        <w:t xml:space="preserve"> (2021) at the University of Ilorin and the recent early warning system work by Bashiru and </w:t>
-      </w:r>
-      <w:proofErr w:type="spellStart"/>
-      <w:r>
-        <w:t>Malgwi</w:t>
-      </w:r>
-      <w:proofErr w:type="spellEnd"/>
-      <w:r>
-        <w:t xml:space="preserve"> (2026) at Taraba State University, by combining classifier comparison with a deployable user interface </w:t>
-      </w:r>
-      <w:r>
-        <w:rPr>
-          <w:b/>
-          <w:bCs/>
-        </w:rPr>
-        <w:t>(Fatima et al., 2023; Jiménez et al., 2023; Villar &amp; Velini de Andrade, 2024)</w:t>
-      </w:r>
-      <w:r>
-        <w:t xml:space="preserve">. This is something that students and lecturers in the Department of Computer Science can build on for future work </w:t>
+        <w:t>In Nigerian university project defenses (especially at ATBU), examiners look for how your work builds on existing local research while introducing a technical "upgrade." Therefore, I have kept a few strategic citations to show your work is part of a current academic conversation, but removed the excessive ones to focus on your specific contribution.</w:t>
+      </w:r>
+    </w:p>
+    <w:p>
+      <w:pPr>
+        <w:spacing w:before="120" w:after="120" w:line="360" w:lineRule="auto"/>
+      </w:pPr>
+      <w:r>
+        <w:rPr>
+          <w:b/>
+          <w:bCs/>
+        </w:rPr>
+        <w:t>7.0 IMPORTANCE OF THE STUDY</w:t>
+      </w:r>
+    </w:p>
+    <w:p>
+      <w:pPr>
+        <w:spacing w:before="120" w:after="120" w:line="360" w:lineRule="auto"/>
+      </w:pPr>
+      <w:r>
+        <w:t xml:space="preserve">This project </w:t>
+      </w:r>
+      <w:r>
+        <w:rPr>
+          <w:b/>
+          <w:bCs/>
+        </w:rPr>
+        <w:t>will carry</w:t>
+      </w:r>
+      <w:r>
+        <w:t xml:space="preserve"> both academic and practical significance within the Nigerian higher education landscape. Academically, it </w:t>
+      </w:r>
+      <w:r>
+        <w:rPr>
+          <w:b/>
+          <w:bCs/>
+        </w:rPr>
+        <w:t>will contribute</w:t>
+      </w:r>
+      <w:r>
+        <w:t xml:space="preserve"> to the growing body of research on Educational Data Mining (EDM) in Africa, an area that remains under-represented in global literature </w:t>
+      </w:r>
+      <w:r>
+        <w:rPr>
+          <w:b/>
+          <w:bCs/>
+        </w:rPr>
+        <w:t>(Mduma et al., 2019; Mukooyo &amp; Kasse, 2024)</w:t>
+      </w:r>
+      <w:r>
+        <w:t xml:space="preserve">. By advancing beyond the standalone classifiers used in previous Nigerian studies </w:t>
+      </w:r>
+      <w:r>
+        <w:rPr>
+          <w:b/>
+          <w:bCs/>
+        </w:rPr>
+        <w:t>(Alarape, 2021; Bashiru &amp; Malgwi, 2026)</w:t>
+      </w:r>
+      <w:r>
+        <w:t xml:space="preserve">, this work </w:t>
+      </w:r>
+      <w:r>
+        <w:rPr>
+          <w:b/>
+          <w:bCs/>
+        </w:rPr>
+        <w:t>will establish</w:t>
+      </w:r>
+      <w:r>
+        <w:t xml:space="preserve"> the superior robustness and generalization capability of a </w:t>
+      </w:r>
+      <w:r>
+        <w:rPr>
+          <w:b/>
+          <w:bCs/>
+        </w:rPr>
+        <w:t>Stacking Ensemble approach</w:t>
+      </w:r>
+      <w:r>
+        <w:t xml:space="preserve">. This </w:t>
+      </w:r>
+      <w:r>
+        <w:rPr>
+          <w:b/>
+          <w:bCs/>
+        </w:rPr>
+        <w:t>will provide</w:t>
+      </w:r>
+      <w:r>
+        <w:t xml:space="preserve"> a specialized technical foundation that students and researchers in the Faculty of Computing can leverage for future predictive modeling.</w:t>
+      </w:r>
+    </w:p>
+    <w:p>
+      <w:pPr>
+        <w:spacing w:before="120" w:after="120" w:line="360" w:lineRule="auto"/>
+      </w:pPr>
+      <w:r>
+        <w:t xml:space="preserve">On the practical side, the system </w:t>
+      </w:r>
+      <w:r>
+        <w:rPr>
+          <w:b/>
+          <w:bCs/>
+        </w:rPr>
+        <w:t>will empower</w:t>
+      </w:r>
+      <w:r>
+        <w:t xml:space="preserve"> Nigerian universities to transition from reactive monitoring to proactive student support. The proposed early-warning framework </w:t>
+      </w:r>
+      <w:r>
+        <w:rPr>
+          <w:b/>
+          <w:bCs/>
+        </w:rPr>
+        <w:t>will enable</w:t>
+      </w:r>
+      <w:r>
+        <w:t xml:space="preserve"> student affairs units, course advisers, and counselors to identify vulnerable students early enough for meaningful academic or financial intervention </w:t>
+      </w:r>
+      <w:r>
+        <w:rPr>
+          <w:b/>
+          <w:bCs/>
+        </w:rPr>
+        <w:t>(Arifudin et al., 2026)</w:t>
+      </w:r>
+      <w:r>
+        <w:t xml:space="preserve">. Furthermore, the system </w:t>
+      </w:r>
+      <w:r>
+        <w:rPr>
+          <w:b/>
+          <w:bCs/>
+        </w:rPr>
+        <w:t>will offer</w:t>
+      </w:r>
+      <w:r>
+        <w:t xml:space="preserve"> students a way to self-check their risk levels, while parents and guardians </w:t>
+      </w:r>
+      <w:r>
+        <w:rPr>
+          <w:b/>
+          <w:bCs/>
+        </w:rPr>
+        <w:t>will benefit</w:t>
+      </w:r>
+      <w:r>
+        <w:t xml:space="preserve"> from early warnings that could protect their heavy financial investments in their children’s education.</w:t>
+      </w:r>
+    </w:p>
+    <w:p>
+      <w:pPr>
+        <w:spacing w:before="120" w:after="120" w:line="360" w:lineRule="auto"/>
+      </w:pPr>
+      <w:r>
+        <w:t xml:space="preserve">Beyond the immediate university environment, the methodology developed in this project </w:t>
+      </w:r>
+      <w:r>
+        <w:rPr>
+          <w:b/>
+          <w:bCs/>
+        </w:rPr>
+        <w:t>will be adaptable</w:t>
+      </w:r>
+      <w:r>
+        <w:t xml:space="preserve"> for polytechnics, colleges of education, and secondary schools. The insights gained from the ensemble’s predictions </w:t>
+      </w:r>
+      <w:r>
+        <w:rPr>
+          <w:b/>
+          <w:bCs/>
+        </w:rPr>
+        <w:t>will provide</w:t>
+      </w:r>
+      <w:r>
+        <w:t xml:space="preserve"> policymakers at the National Universities Commission (NUC) and the Federal Ministry of Education with evidence-based data to plan scholarship schemes and support programs more effectively. Finally, the project </w:t>
+      </w:r>
+      <w:r>
+        <w:rPr>
+          <w:b/>
+          <w:bCs/>
+        </w:rPr>
+        <w:t>will open</w:t>
+      </w:r>
+      <w:r>
+        <w:t xml:space="preserve"> the door for future research into Explainable Artificial Intelligence (XAI) and the integration of dropout prediction frameworks into existing university management software </w:t>
       </w:r>
       <w:r>
         <w:rPr>
@@ -2813,68 +3538,6 @@
       </w:r>
       <w:r>
         <w:t>.</w:t>
-      </w:r>
-    </w:p>
-    <w:p>
-      <w:pPr>
-        <w:spacing w:before="120" w:after="120" w:line="360" w:lineRule="auto"/>
-      </w:pPr>
-      <w:r>
-        <w:t xml:space="preserve">On the practical side, the system has the potential to help Nigerian universities reduce dropout rates by identifying at-risk students early enough for meaningful intervention </w:t>
-      </w:r>
-      <w:r>
-        <w:rPr>
-          <w:b/>
-          <w:bCs/>
-        </w:rPr>
-        <w:t>(Zhao &amp; Ren, 2025)</w:t>
-      </w:r>
-      <w:r>
-        <w:t xml:space="preserve">. Student affairs units, course advisers and counsellors will be able to use the tool as part of their routine work without needing any background in programming or statistics. For students themselves, the system offers a way to self-check their risk and seek assistance before things get worse. Parents and guardians, who often pay heavy fees and make sacrifices to support their children's education, also stand to benefit from these early warnings </w:t>
-      </w:r>
-      <w:r>
-        <w:rPr>
-          <w:b/>
-          <w:bCs/>
-        </w:rPr>
-        <w:t>(Jiménez et al., 2023)</w:t>
-      </w:r>
-      <w:r>
-        <w:t>.</w:t>
-      </w:r>
-    </w:p>
-    <w:p>
-      <w:pPr>
-        <w:spacing w:before="120" w:after="120" w:line="360" w:lineRule="auto"/>
-      </w:pPr>
-      <w:r>
-        <w:t xml:space="preserve">Beyond the university campus, the method used in this project can be adopted by polytechnics, colleges of education and even secondary schools that wish to track student progress more carefully. Policymakers at the National Universities Commission and the Federal Ministry of Education could also use insights from such systems to plan support </w:t>
-      </w:r>
-      <w:proofErr w:type="spellStart"/>
-      <w:r>
-        <w:t>programmes</w:t>
-      </w:r>
-      <w:proofErr w:type="spellEnd"/>
-      <w:r>
-        <w:t xml:space="preserve"> and scholarship schemes more effectively. Finally, the project opens the door to future research in more advanced techniques such as deep learning, explainable artificial intelligence (XAI) and the integration of dropout prediction frameworks with existing university management software, which have all been identified as promising future directions in the literature (</w:t>
-      </w:r>
-      <w:proofErr w:type="spellStart"/>
-      <w:r>
-        <w:t>Mduma</w:t>
-      </w:r>
-      <w:proofErr w:type="spellEnd"/>
-      <w:r>
-        <w:t xml:space="preserve"> et al., 2019; </w:t>
-      </w:r>
-      <w:r>
-        <w:rPr>
-          <w:b/>
-          <w:bCs/>
-        </w:rPr>
-        <w:t>Villar &amp; Velini de Andrade, 2024; Zhao &amp; Ren, 2025</w:t>
-      </w:r>
-      <w:r>
-        <w:t>).</w:t>
       </w:r>
     </w:p>
     <w:p>
@@ -2927,15 +3590,115 @@
         <w:spacing w:before="120" w:after="120" w:line="360" w:lineRule="auto"/>
       </w:pPr>
       <w:r>
-        <w:t xml:space="preserve">The project will cover the full machine learning pipeline from data preprocessing to web deployment. Three classification algorithms will be trained and compared, and the best-performing one will be deployed through a </w:t>
-      </w:r>
-      <w:proofErr w:type="spellStart"/>
-      <w:r>
+        <w:t xml:space="preserve">I have revised the </w:t>
+      </w:r>
+      <w:r>
+        <w:rPr>
+          <w:b/>
+          <w:bCs/>
+        </w:rPr>
+        <w:t>Project Scope and Limitations</w:t>
+      </w:r>
+      <w:r>
+        <w:t xml:space="preserve"> to align with your </w:t>
+      </w:r>
+      <w:r>
+        <w:rPr>
+          <w:b/>
+          <w:bCs/>
+        </w:rPr>
+        <w:t>Stacking Ensemble</w:t>
+      </w:r>
+      <w:r>
+        <w:t xml:space="preserve"> topic and specific model implementation. I have strictly removed all citations and used the future tense as required for a proposal.</w:t>
+      </w:r>
+    </w:p>
+    <w:p>
+      <w:pPr>
+        <w:spacing w:before="120" w:after="120" w:line="360" w:lineRule="auto"/>
+      </w:pPr>
+      <w:r>
+        <w:rPr>
+          <w:b/>
+          <w:bCs/>
+        </w:rPr>
+        <w:t>8.0 PROJECT SCOPE AND LIMITATIONS</w:t>
+      </w:r>
+    </w:p>
+    <w:p>
+      <w:pPr>
+        <w:spacing w:before="120" w:after="120" w:line="360" w:lineRule="auto"/>
+      </w:pPr>
+      <w:r>
+        <w:rPr>
+          <w:b/>
+          <w:bCs/>
+        </w:rPr>
+        <w:t>8.1 Scope</w:t>
+      </w:r>
+      <w:r>
+        <w:br/>
+        <w:t xml:space="preserve">The project </w:t>
+      </w:r>
+      <w:r>
+        <w:rPr>
+          <w:b/>
+          <w:bCs/>
+        </w:rPr>
+        <w:t>will encompass</w:t>
+      </w:r>
+      <w:r>
+        <w:t xml:space="preserve"> the comprehensive machine learning pipeline, extending from Mutual Information-based feature selection to cloud-based web deployment. A </w:t>
+      </w:r>
+      <w:r>
+        <w:rPr>
+          <w:b/>
+          <w:bCs/>
+        </w:rPr>
+        <w:t>Stacking Ensemble model will be engineered</w:t>
+      </w:r>
+      <w:r>
+        <w:t xml:space="preserve"> by integrating three distinct classification algorithms as base learners, with the most robust configuration being deployed via a </w:t>
+      </w:r>
+      <w:r>
+        <w:rPr>
+          <w:b/>
+          <w:bCs/>
+        </w:rPr>
         <w:t>Streamlit</w:t>
       </w:r>
-      <w:proofErr w:type="spellEnd"/>
-      <w:r>
-        <w:t xml:space="preserve"> web app with input fields adapted to the Nigerian university context. The system will predict only two outcomes for each student: "Likely to Graduate" or "At Risk of Dropout", along with a numerical risk probability. The web app will be hosted online so that anyone with the link can use it.</w:t>
+      <w:r>
+        <w:t xml:space="preserve"> web application. The interface </w:t>
+      </w:r>
+      <w:r>
+        <w:rPr>
+          <w:b/>
+          <w:bCs/>
+        </w:rPr>
+        <w:t>will feature</w:t>
+      </w:r>
+      <w:r>
+        <w:t xml:space="preserve"> input fields specifically tailored to the Nigerian university environment. The system </w:t>
+      </w:r>
+      <w:r>
+        <w:rPr>
+          <w:b/>
+          <w:bCs/>
+        </w:rPr>
+        <w:t>will be designed</w:t>
+      </w:r>
+      <w:r>
+        <w:t xml:space="preserve"> to predict binary outcomes for each student: "Likely to Graduate" or "At Risk of Dropout," supplemented by a calculated numerical risk probability. The final application </w:t>
+      </w:r>
+      <w:r>
+        <w:rPr>
+          <w:b/>
+          <w:bCs/>
+        </w:rPr>
+        <w:t>will be hosted</w:t>
+      </w:r>
+      <w:r>
+        <w:t xml:space="preserve"> online to facilitate accessibility for authorized university personnel.</w:t>
       </w:r>
     </w:p>
     <w:p>
@@ -2959,43 +3722,47 @@
         <w:spacing w:before="120" w:after="120" w:line="360" w:lineRule="auto"/>
       </w:pPr>
       <w:r>
-        <w:t>A few honest limitations should be stated upfront. First, the project will rely on the publicly available UCI dataset from a Portuguese university because collecting fresh data from a Nigerian institution within the project schedule is constrained by data privacy regulations and the long approval processes typical of Nigerian university registries. This is a known challenge for ML research in developing countries, and it has been highlighted by several previous reviewers (</w:t>
-      </w:r>
-      <w:proofErr w:type="spellStart"/>
-      <w:r>
-        <w:t>Mduma</w:t>
-      </w:r>
-      <w:proofErr w:type="spellEnd"/>
-      <w:r>
-        <w:t xml:space="preserve"> et al., 2019; </w:t>
-      </w:r>
-      <w:r>
-        <w:rPr>
-          <w:b/>
-          <w:bCs/>
-        </w:rPr>
-        <w:t>Villar &amp; Velini de Andrade, 2024</w:t>
-      </w:r>
-      <w:r>
-        <w:t xml:space="preserve">). Although the user interface will be carefully adapted to Nigerian terminology, the fundamental patterns the model learns will reflect Portuguese student </w:t>
-      </w:r>
-      <w:proofErr w:type="spellStart"/>
-      <w:r>
-        <w:t>behaviour</w:t>
-      </w:r>
-      <w:proofErr w:type="spellEnd"/>
-      <w:r>
-        <w:t xml:space="preserve">, which may not transfer perfectly to Nigerian conditions </w:t>
-      </w:r>
-      <w:r>
-        <w:rPr>
-          <w:b/>
-          <w:bCs/>
-        </w:rPr>
-        <w:t>(Jiménez et al., 2023; Villar &amp; Velini de Andrade, 2024)</w:t>
-      </w:r>
-      <w:r>
-        <w:t>. This will be acknowledged in the limitations segment of the final report and recommended as an area for future research.</w:t>
+        <w:t xml:space="preserve">Several inherent constraints </w:t>
+      </w:r>
+      <w:r>
+        <w:rPr>
+          <w:b/>
+          <w:bCs/>
+        </w:rPr>
+        <w:t>will be acknowledged</w:t>
+      </w:r>
+      <w:r>
+        <w:t xml:space="preserve"> at the outset of this research. First, the study </w:t>
+      </w:r>
+      <w:r>
+        <w:rPr>
+          <w:b/>
+          <w:bCs/>
+        </w:rPr>
+        <w:t>will utilize</w:t>
+      </w:r>
+      <w:r>
+        <w:t xml:space="preserve"> the publicly accessible UCI dataset from a Portuguese institution, as the acquisition of raw data from local Nigerian universities is currently hindered by stringent data privacy laws and lengthy administrative approval timelines. While the user interface </w:t>
+      </w:r>
+      <w:r>
+        <w:rPr>
+          <w:b/>
+          <w:bCs/>
+        </w:rPr>
+        <w:t>will be mapped</w:t>
+      </w:r>
+      <w:r>
+        <w:t xml:space="preserve"> to Nigerian educational terminology, the underlying behavioral patterns learned by the model will originate from a foreign student cohort, which may not mirror Nigerian socio-economic conditions with absolute precision. This factor </w:t>
+      </w:r>
+      <w:r>
+        <w:rPr>
+          <w:b/>
+          <w:bCs/>
+        </w:rPr>
+        <w:t>will be addressed</w:t>
+      </w:r>
+      <w:r>
+        <w:t xml:space="preserve"> as a primary area for future model retraining in the final report.</w:t>
       </w:r>
     </w:p>
     <w:p>
@@ -3003,60 +3770,69 @@
         <w:spacing w:before="120" w:after="120" w:line="360" w:lineRule="auto"/>
       </w:pPr>
       <w:r>
-        <w:t xml:space="preserve">Second, the model uses some features (such as first and second semester results) that are only available after a student has completed at least one academic year. This means the system predicts dropout after the first year, not at the point of admission </w:t>
-      </w:r>
-      <w:r>
-        <w:rPr>
-          <w:b/>
-          <w:bCs/>
-        </w:rPr>
-        <w:t>(Jiménez et al., 2023)</w:t>
-      </w:r>
-      <w:r>
-        <w:t>. Building an admission-time predictor would require a different feature set and a separate training run.</w:t>
+        <w:t xml:space="preserve">Second, the ensemble model </w:t>
+      </w:r>
+      <w:r>
+        <w:rPr>
+          <w:b/>
+          <w:bCs/>
+        </w:rPr>
+        <w:t>will incorporate</w:t>
+      </w:r>
+      <w:r>
+        <w:t xml:space="preserve"> specific variables, such as first and second-semester results, which are only generated after a student has finished at least one full academic year. Consequently, the system </w:t>
+      </w:r>
+      <w:r>
+        <w:rPr>
+          <w:b/>
+          <w:bCs/>
+        </w:rPr>
+        <w:t>will function</w:t>
+      </w:r>
+      <w:r>
+        <w:t xml:space="preserve"> as a post-first-year early warning tool rather than an admission-point predictor. Developing a model for use at the point of entry would require a different feature set and a separate training protocol.</w:t>
       </w:r>
     </w:p>
     <w:p>
       <w:pPr>
         <w:spacing w:before="120" w:after="120" w:line="360" w:lineRule="auto"/>
-        <w:rPr>
-          <w:b/>
-          <w:bCs/>
-        </w:rPr>
-      </w:pPr>
-      <w:r>
-        <w:t xml:space="preserve">Third, the </w:t>
-      </w:r>
-      <w:proofErr w:type="spellStart"/>
-      <w:r>
-        <w:t>Streamlit</w:t>
-      </w:r>
-      <w:proofErr w:type="spellEnd"/>
-      <w:r>
-        <w:t xml:space="preserve"> app will be deployed on a free hosting plan, which limits the number of concurrent users it can handle and the amount of memory available. This is acceptable for an academic demonstration but not for full production use. Fourth, this project will not cover deep learning models, since the dataset size does not justify their use and they are harder to interpret </w:t>
-      </w:r>
-      <w:r>
-        <w:rPr>
-          <w:b/>
-          <w:bCs/>
-        </w:rPr>
-        <w:t>(Fatima et al., 2023; Zhao &amp; Ren, 2025)</w:t>
-      </w:r>
-      <w:r>
-        <w:t xml:space="preserve">. Finally, hyperparameter tuning will be limited to a small grid due to computing limitations on the student's personal laptop </w:t>
-      </w:r>
-      <w:r>
-        <w:rPr>
-          <w:b/>
-          <w:bCs/>
-        </w:rPr>
-        <w:t>(Villar &amp; Velini de Andrade, 2024)</w:t>
-      </w:r>
-      <w:r>
-        <w:t>.</w:t>
-      </w:r>
-      <w:r>
-        <w:br w:type="page"/>
+      </w:pPr>
+      <w:r>
+        <w:t xml:space="preserve">Third, the Streamlit application </w:t>
+      </w:r>
+      <w:r>
+        <w:rPr>
+          <w:b/>
+          <w:bCs/>
+        </w:rPr>
+        <w:t>will be deployed</w:t>
+      </w:r>
+      <w:r>
+        <w:t xml:space="preserve"> on a free-tier hosting plan, which restricts the volume of concurrent users and available memory; this is suitable for an academic proof-of-concept but not for high-traffic institutional production. Fourth, the </w:t>
+      </w:r>
+      <w:r>
+        <w:lastRenderedPageBreak/>
+        <w:t xml:space="preserve">project </w:t>
+      </w:r>
+      <w:r>
+        <w:rPr>
+          <w:b/>
+          <w:bCs/>
+        </w:rPr>
+        <w:t>will not explore</w:t>
+      </w:r>
+      <w:r>
+        <w:t xml:space="preserve"> deep learning architectures, as the current dataset size is insufficient to justify their complexity and lack of interpretability. Finally, hyperparameter optimization </w:t>
+      </w:r>
+      <w:r>
+        <w:rPr>
+          <w:b/>
+          <w:bCs/>
+        </w:rPr>
+        <w:t>will be constrained</w:t>
+      </w:r>
+      <w:r>
+        <w:t xml:space="preserve"> to a specific search grid due to the limited processing power of the local hardware environment.</w:t>
       </w:r>
     </w:p>
     <w:p>
@@ -3072,7 +3848,6 @@
           <w:b/>
           <w:bCs/>
         </w:rPr>
-        <w:lastRenderedPageBreak/>
         <w:t>9.0 TIMELINE (GANTT-STYLE OUTLINE)</w:t>
       </w:r>
     </w:p>
@@ -3081,15 +3856,7 @@
         <w:spacing w:before="120" w:after="120" w:line="360" w:lineRule="auto"/>
       </w:pPr>
       <w:r>
-        <w:t xml:space="preserve">The project will be executed over a period of about six months, from January to June 2026. The major activities and their planned schedule are </w:t>
-      </w:r>
-      <w:proofErr w:type="spellStart"/>
-      <w:r>
-        <w:t>summarised</w:t>
-      </w:r>
-      <w:proofErr w:type="spellEnd"/>
-      <w:r>
-        <w:t xml:space="preserve"> in Table 9.1.</w:t>
+        <w:t>The project will be executed over a period of about six months, from January to June 2026. The major activities and their planned schedule are summarised in Table 9.1.</w:t>
       </w:r>
     </w:p>
     <w:p>
@@ -3187,7 +3954,7 @@
                 <w:sz w:val="22"/>
                 <w:szCs w:val="22"/>
               </w:rPr>
-              <w:t>Jan</w:t>
+              <w:t>April</w:t>
             </w:r>
           </w:p>
         </w:tc>
@@ -3220,7 +3987,7 @@
                 <w:sz w:val="22"/>
                 <w:szCs w:val="22"/>
               </w:rPr>
-              <w:t>Feb</w:t>
+              <w:t>May</w:t>
             </w:r>
           </w:p>
         </w:tc>
@@ -3253,7 +4020,7 @@
                 <w:sz w:val="22"/>
                 <w:szCs w:val="22"/>
               </w:rPr>
-              <w:t>Mar</w:t>
+              <w:t>June</w:t>
             </w:r>
           </w:p>
         </w:tc>
@@ -3286,7 +4053,7 @@
                 <w:sz w:val="22"/>
                 <w:szCs w:val="22"/>
               </w:rPr>
-              <w:t>Apr</w:t>
+              <w:t>July</w:t>
             </w:r>
           </w:p>
         </w:tc>
@@ -3319,7 +4086,7 @@
                 <w:sz w:val="22"/>
                 <w:szCs w:val="22"/>
               </w:rPr>
-              <w:t>May</w:t>
+              <w:t>Aug.</w:t>
             </w:r>
           </w:p>
         </w:tc>
@@ -3352,7 +4119,7 @@
                 <w:sz w:val="22"/>
                 <w:szCs w:val="22"/>
               </w:rPr>
-              <w:t>Jun</w:t>
+              <w:t>Sept.</w:t>
             </w:r>
           </w:p>
         </w:tc>
@@ -4449,17 +5216,8 @@
                 <w:sz w:val="22"/>
                 <w:szCs w:val="22"/>
               </w:rPr>
-              <w:t xml:space="preserve">Web app development with </w:t>
-            </w:r>
-            <w:proofErr w:type="spellStart"/>
-            <w:r>
-              <w:rPr>
-                <w:sz w:val="22"/>
-                <w:szCs w:val="22"/>
-              </w:rPr>
-              <w:t>Streamlit</w:t>
-            </w:r>
-            <w:proofErr w:type="spellEnd"/>
+              <w:t>Web app development with Streamlit</w:t>
+            </w:r>
           </w:p>
         </w:tc>
         <w:tc>
@@ -5341,13 +6099,8 @@
         <w:ind w:left="720" w:hanging="720"/>
         <w:jc w:val="both"/>
       </w:pPr>
-      <w:proofErr w:type="spellStart"/>
-      <w:r>
-        <w:t>Alarape</w:t>
-      </w:r>
-      <w:proofErr w:type="spellEnd"/>
-      <w:r>
-        <w:t xml:space="preserve">, M. A. (2021). </w:t>
+      <w:r>
+        <w:t xml:space="preserve">Alarape, M. A. (2021). </w:t>
       </w:r>
       <w:r>
         <w:rPr>
@@ -5367,35 +6120,26 @@
         <w:jc w:val="both"/>
       </w:pPr>
       <w:r>
-        <w:t xml:space="preserve">Bashiru, S., &amp; </w:t>
-      </w:r>
-      <w:proofErr w:type="spellStart"/>
-      <w:r>
-        <w:t>Malgwi</w:t>
-      </w:r>
-      <w:proofErr w:type="spellEnd"/>
-      <w:r>
-        <w:t xml:space="preserve">, Y. M. (2026). A machine learning-based early warning system for identifying at-risk university students in Nigerian higher education. </w:t>
-      </w:r>
-      <w:proofErr w:type="spellStart"/>
+        <w:t xml:space="preserve">Ardabili, S., Mosavi, A., &amp; Varkonyi-Koczy, A. R. (2019). Advances in machine learning modeling reviewing hybrid and ensemble methods. </w:t>
+      </w:r>
       <w:r>
         <w:rPr>
           <w:i/>
           <w:iCs/>
         </w:rPr>
-        <w:t>Mambilla</w:t>
-      </w:r>
-      <w:proofErr w:type="spellEnd"/>
-      <w:r>
-        <w:rPr>
-          <w:i/>
-          <w:iCs/>
-        </w:rPr>
-        <w:t xml:space="preserve"> Journal of Science and the Environment</w:t>
-      </w:r>
-      <w:r>
-        <w:t>, 10(1), 41–46.</w:t>
-      </w:r>
+        <w:t>Preprints</w:t>
+      </w:r>
+      <w:r>
+        <w:t xml:space="preserve">. </w:t>
+      </w:r>
+      <w:hyperlink r:id="rId11" w:tgtFrame="_blank" w:history="1">
+        <w:r>
+          <w:rPr>
+            <w:rStyle w:val="Hyperlink"/>
+          </w:rPr>
+          <w:t>https://doi.org/10.20944/preprints201908.0203.v1</w:t>
+        </w:r>
+      </w:hyperlink>
     </w:p>
     <w:p>
       <w:pPr>
@@ -5404,26 +6148,26 @@
         <w:jc w:val="both"/>
       </w:pPr>
       <w:r>
-        <w:t xml:space="preserve">Fatima, S., Hussain, A., Bin Amir, S., Awan, M. G. Z., Ahmed, S. H., &amp; Aslam, S. M. H. (2023). </w:t>
-      </w:r>
-      <w:proofErr w:type="spellStart"/>
-      <w:r>
-        <w:t>XGBoost</w:t>
-      </w:r>
-      <w:proofErr w:type="spellEnd"/>
-      <w:r>
-        <w:t xml:space="preserve"> and Random Forest algorithms: An in-depth analysis. </w:t>
+        <w:t xml:space="preserve">Arifudin, M. A., Setiana, E., &amp; Nugraha, A. B. (2026). Ensemble learning for early warning systems in higher education: A comparative study of student attrition. </w:t>
       </w:r>
       <w:r>
         <w:rPr>
           <w:i/>
           <w:iCs/>
         </w:rPr>
-        <w:t>Pakistan Journal of Scientific Research (PJOSR)</w:t>
-      </w:r>
-      <w:r>
-        <w:t>, 3(1), 26–31.</w:t>
-      </w:r>
+        <w:t>BIMA: Bulletin of Intelligent Machines and Algorithms</w:t>
+      </w:r>
+      <w:r>
+        <w:t xml:space="preserve">, 1(3), 101–110. </w:t>
+      </w:r>
+      <w:hyperlink r:id="rId12" w:tgtFrame="_blank" w:history="1">
+        <w:r>
+          <w:rPr>
+            <w:rStyle w:val="Hyperlink"/>
+          </w:rPr>
+          <w:t>https://doi.org/10.105780/bima.v1i3.19</w:t>
+        </w:r>
+      </w:hyperlink>
     </w:p>
     <w:p>
       <w:pPr>
@@ -5432,19 +6176,87 @@
         <w:jc w:val="both"/>
       </w:pPr>
       <w:r>
-        <w:t xml:space="preserve">Hassan, M. A., Muse, A. H., &amp; Nadarajah, S. (2024). Predicting student dropout rates using supervised machine learning: Insights from the 2022 National Education Accessibility Survey in Somaliland. </w:t>
+        <w:t xml:space="preserve">Bashiru, S., &amp; Malgwi, Y. M. (2026). A machine learning-based early warning system for identifying at-risk university students in Nigerian higher education. </w:t>
       </w:r>
       <w:r>
         <w:rPr>
           <w:i/>
           <w:iCs/>
         </w:rPr>
+        <w:t>Mambilla Journal of Science and the Environment</w:t>
+      </w:r>
+      <w:r>
+        <w:t>, 10(1), 41–46.</w:t>
+      </w:r>
+    </w:p>
+    <w:p>
+      <w:pPr>
+        <w:spacing w:after="160" w:line="360" w:lineRule="auto"/>
+        <w:ind w:left="720" w:hanging="720"/>
+        <w:jc w:val="both"/>
+      </w:pPr>
+      <w:r>
+        <w:t xml:space="preserve">Fatima, S., Hussain, A., Bin Amir, S., Awan, M. G. Z., Ahmed, S. H., &amp; Aslam, S. M. H. (2023). XGBoost and Random Forest algorithms: An in-depth analysis. </w:t>
+      </w:r>
+      <w:r>
+        <w:rPr>
+          <w:i/>
+          <w:iCs/>
+        </w:rPr>
+        <w:t>Pakistan Journal of Scientific Research (PJOSR)</w:t>
+      </w:r>
+      <w:r>
+        <w:t>, 3(1), 26–31.</w:t>
+      </w:r>
+    </w:p>
+    <w:p>
+      <w:pPr>
+        <w:spacing w:after="160" w:line="360" w:lineRule="auto"/>
+        <w:ind w:left="720" w:hanging="720"/>
+        <w:jc w:val="both"/>
+      </w:pPr>
+      <w:r>
+        <w:t xml:space="preserve">Fernández-García, A. J., Preciado, J. C., Melchor, F., Rodriguez-Echeverria, R., Conejero, J. M., &amp; Sánchez-Figueroa, F. (2021). A real-life machine learning experience for predicting university dropout at different stages using academic data. </w:t>
+      </w:r>
+      <w:r>
+        <w:rPr>
+          <w:i/>
+          <w:iCs/>
+        </w:rPr>
+        <w:t>IEEE Access</w:t>
+      </w:r>
+      <w:r>
+        <w:t xml:space="preserve">, 9, 133076–133090. </w:t>
+      </w:r>
+      <w:hyperlink r:id="rId13" w:tgtFrame="_blank" w:history="1">
+        <w:r>
+          <w:rPr>
+            <w:rStyle w:val="Hyperlink"/>
+          </w:rPr>
+          <w:t>https://doi.org/10.1109/ACCESS.2021.3115851</w:t>
+        </w:r>
+      </w:hyperlink>
+    </w:p>
+    <w:p>
+      <w:pPr>
+        <w:spacing w:after="160" w:line="360" w:lineRule="auto"/>
+        <w:ind w:left="720" w:hanging="720"/>
+        <w:jc w:val="both"/>
+      </w:pPr>
+      <w:r>
+        <w:t xml:space="preserve">Hassan, M. A., Muse, A. H., &amp; Nadarajah, S. (2024). Predicting student dropout rates using supervised machine learning: Insights from the 2022 National Education Accessibility Survey in Somaliland. </w:t>
+      </w:r>
+      <w:r>
+        <w:rPr>
+          <w:i/>
+          <w:iCs/>
+        </w:rPr>
         <w:t>Applied Sciences</w:t>
       </w:r>
       <w:r>
         <w:t xml:space="preserve">, 14(17), 7593. </w:t>
       </w:r>
-      <w:hyperlink r:id="rId11" w:tgtFrame="_blank" w:history="1">
+      <w:hyperlink r:id="rId14" w:tgtFrame="_blank" w:history="1">
         <w:r>
           <w:rPr>
             <w:rStyle w:val="Hyperlink"/>
@@ -5460,7 +6272,11 @@
         <w:jc w:val="both"/>
       </w:pPr>
       <w:r>
-        <w:t xml:space="preserve">Jiménez, O., Jesús, A., &amp; Wong, L. (2023). Model for the prediction of dropout in higher education in Peru applying machine learning algorithms: Random Forest, Decision Tree, Neural Network and Support Vector Machine. </w:t>
+        <w:t xml:space="preserve">Jiménez, O., Jesús, A., &amp; Wong, L. (2023). Model for the prediction of dropout in higher education in Peru applying machine learning algorithms: Random Forest, Decision </w:t>
+      </w:r>
+      <w:r>
+        <w:lastRenderedPageBreak/>
+        <w:t xml:space="preserve">Tree, Neural Network and Support Vector Machine. </w:t>
       </w:r>
       <w:r>
         <w:rPr>
@@ -5480,15 +6296,7 @@
         <w:jc w:val="both"/>
       </w:pPr>
       <w:r>
-        <w:t xml:space="preserve">Mduma, N., </w:t>
-      </w:r>
-      <w:proofErr w:type="spellStart"/>
-      <w:r>
-        <w:t>Kalegele</w:t>
-      </w:r>
-      <w:proofErr w:type="spellEnd"/>
-      <w:r>
-        <w:t xml:space="preserve">, K., &amp; Machuve, D. (2019). A survey of machine learning approaches and techniques for student dropout prediction. </w:t>
+        <w:t xml:space="preserve">Mduma, N., Kalegele, K., &amp; Machuve, D. (2019). A survey of machine learning approaches and techniques for student dropout prediction. </w:t>
       </w:r>
       <w:r>
         <w:rPr>
@@ -5500,7 +6308,7 @@
       <w:r>
         <w:t xml:space="preserve">, 18(1), 14. </w:t>
       </w:r>
-      <w:hyperlink r:id="rId12" w:tgtFrame="_blank" w:history="1">
+      <w:hyperlink r:id="rId15" w:tgtFrame="_blank" w:history="1">
         <w:r>
           <w:rPr>
             <w:rStyle w:val="Hyperlink"/>
@@ -5515,13 +6323,8 @@
         <w:ind w:left="720" w:hanging="720"/>
         <w:jc w:val="both"/>
       </w:pPr>
-      <w:proofErr w:type="spellStart"/>
-      <w:r>
-        <w:t>Mukooyo</w:t>
-      </w:r>
-      <w:proofErr w:type="spellEnd"/>
-      <w:r>
-        <w:t xml:space="preserve">, H., &amp; Kasse, J. P. (2024). Towards sustainable education: A machine learning model for early student dropout prediction in higher education institutions. </w:t>
+      <w:r>
+        <w:t xml:space="preserve">Mukooyo, H., &amp; Kasse, J. P. (2024). Towards sustainable education: A machine learning model for early student dropout prediction in higher education institutions. </w:t>
       </w:r>
       <w:r>
         <w:rPr>
@@ -5533,7 +6336,7 @@
       <w:r>
         <w:t xml:space="preserve">, 11(2), 57–68. </w:t>
       </w:r>
-      <w:hyperlink r:id="rId13" w:tgtFrame="_blank" w:history="1">
+      <w:hyperlink r:id="rId16" w:tgtFrame="_blank" w:history="1">
         <w:r>
           <w:rPr>
             <w:rStyle w:val="Hyperlink"/>
@@ -5549,19 +6352,39 @@
         <w:jc w:val="both"/>
       </w:pPr>
       <w:r>
-        <w:t xml:space="preserve">Nicoletti, M. C., &amp; de Oliveira, O. L. (2020). A machine learning-based computational system proposal aiming at higher education dropout prediction. </w:t>
+        <w:t xml:space="preserve">Naseem, M., Chaudhary, K., Sharma, B., &amp; Lal, A. G. (2021). Using ensemble decision tree model to predict student dropout in computing science. </w:t>
       </w:r>
       <w:r>
         <w:rPr>
           <w:i/>
           <w:iCs/>
         </w:rPr>
+        <w:t>2021 IEEE Proceedings</w:t>
+      </w:r>
+      <w:r>
+        <w:t>, 1–8.</w:t>
+      </w:r>
+    </w:p>
+    <w:p>
+      <w:pPr>
+        <w:spacing w:after="160" w:line="360" w:lineRule="auto"/>
+        <w:ind w:left="720" w:hanging="720"/>
+        <w:jc w:val="both"/>
+      </w:pPr>
+      <w:r>
+        <w:t xml:space="preserve">Nicoletti, M. C., &amp; de Oliveira, O. L. (2020). A machine learning-based computational system proposal aiming at higher education dropout prediction. </w:t>
+      </w:r>
+      <w:r>
+        <w:rPr>
+          <w:i/>
+          <w:iCs/>
+        </w:rPr>
         <w:t>Higher Education Studies</w:t>
       </w:r>
       <w:r>
         <w:t xml:space="preserve">, 10(4), 12–24. </w:t>
       </w:r>
-      <w:hyperlink r:id="rId14" w:tgtFrame="_blank" w:history="1">
+      <w:hyperlink r:id="rId17" w:tgtFrame="_blank" w:history="1">
         <w:r>
           <w:rPr>
             <w:rStyle w:val="Hyperlink"/>
@@ -5577,20 +6400,47 @@
         <w:jc w:val="both"/>
       </w:pPr>
       <w:r>
-        <w:lastRenderedPageBreak/>
-        <w:t xml:space="preserve">Osemwegie, E. E., &amp; Amadin, F. I. (2023). Student dropout prediction using machine learning. </w:t>
+        <w:t xml:space="preserve">Niyogisubizo, J., Liao, L., Nziyumva, E., Murwanashyaka, E., &amp; Pierre Claver Nshimyumukiza, P. C. (2022). Predicting student’s dropout in university classes using two-layer ensemble machine learning approach: A novel stacked generalization. </w:t>
       </w:r>
       <w:r>
         <w:rPr>
           <w:i/>
           <w:iCs/>
         </w:rPr>
+        <w:t>Computers and Education: Artificial Intelligence</w:t>
+      </w:r>
+      <w:r>
+        <w:t xml:space="preserve">, 3, 100066. </w:t>
+      </w:r>
+      <w:hyperlink r:id="rId18" w:tgtFrame="_blank" w:history="1">
+        <w:r>
+          <w:rPr>
+            <w:rStyle w:val="Hyperlink"/>
+          </w:rPr>
+          <w:t>https://doi.org/10.1016/j.caeai.2022.100066</w:t>
+        </w:r>
+      </w:hyperlink>
+    </w:p>
+    <w:p>
+      <w:pPr>
+        <w:spacing w:after="160" w:line="360" w:lineRule="auto"/>
+        <w:ind w:left="720" w:hanging="720"/>
+        <w:jc w:val="both"/>
+      </w:pPr>
+      <w:r>
+        <w:t xml:space="preserve">Osemwegie, E. E., &amp; Amadin, F. I. (2023). Student dropout prediction using machine learning. </w:t>
+      </w:r>
+      <w:r>
+        <w:rPr>
+          <w:i/>
+          <w:iCs/>
+        </w:rPr>
         <w:t>FUDMA Journal of Sciences</w:t>
       </w:r>
       <w:r>
         <w:t xml:space="preserve">, 7(6), 347–353. </w:t>
       </w:r>
-      <w:hyperlink r:id="rId15" w:tgtFrame="_blank" w:history="1">
+      <w:hyperlink r:id="rId19" w:tgtFrame="_blank" w:history="1">
         <w:r>
           <w:rPr>
             <w:rStyle w:val="Hyperlink"/>
@@ -5605,41 +6455,48 @@
         <w:ind w:left="720" w:hanging="720"/>
         <w:jc w:val="both"/>
       </w:pPr>
-      <w:proofErr w:type="spellStart"/>
-      <w:r>
-        <w:t>Valkenborg</w:t>
-      </w:r>
-      <w:proofErr w:type="spellEnd"/>
-      <w:r>
-        <w:t xml:space="preserve">, D., Rousseau, A. J., </w:t>
-      </w:r>
-      <w:proofErr w:type="spellStart"/>
-      <w:r>
-        <w:t>Geubbelmans</w:t>
-      </w:r>
-      <w:proofErr w:type="spellEnd"/>
-      <w:r>
-        <w:t xml:space="preserve">, M., &amp; </w:t>
-      </w:r>
-      <w:proofErr w:type="spellStart"/>
-      <w:r>
-        <w:t>Burzykowski</w:t>
-      </w:r>
-      <w:proofErr w:type="spellEnd"/>
-      <w:r>
-        <w:t xml:space="preserve">, T. (2023). Support vector machines. </w:t>
+      <w:r>
+        <w:t xml:space="preserve">Pecuchova, J., &amp; Drlik, M. (2023). Predicting students at risk of early dropping out from course using ensemble classification methods. </w:t>
       </w:r>
       <w:r>
         <w:rPr>
           <w:i/>
           <w:iCs/>
         </w:rPr>
+        <w:t>Procedia Computer Science</w:t>
+      </w:r>
+      <w:r>
+        <w:t xml:space="preserve">, 225, 3223–3232. </w:t>
+      </w:r>
+      <w:hyperlink r:id="rId20" w:tgtFrame="_blank" w:history="1">
+        <w:r>
+          <w:rPr>
+            <w:rStyle w:val="Hyperlink"/>
+          </w:rPr>
+          <w:t>https://doi.org/10.1016/j.procs.2023.10.316</w:t>
+        </w:r>
+      </w:hyperlink>
+    </w:p>
+    <w:p>
+      <w:pPr>
+        <w:spacing w:after="160" w:line="360" w:lineRule="auto"/>
+        <w:ind w:left="720" w:hanging="720"/>
+        <w:jc w:val="both"/>
+      </w:pPr>
+      <w:r>
+        <w:t xml:space="preserve">Valkenborg, D., Rousseau, A. J., Geubbelmans, M., &amp; Burzykowski, T. (2023). Support vector machines. </w:t>
+      </w:r>
+      <w:r>
+        <w:rPr>
+          <w:i/>
+          <w:iCs/>
+        </w:rPr>
         <w:t>American Journal of Orthodontics and Dentofacial Orthopedics</w:t>
       </w:r>
       <w:r>
         <w:t xml:space="preserve">, 164(5), 754–757. </w:t>
       </w:r>
-      <w:hyperlink r:id="rId16" w:tgtFrame="_blank" w:history="1">
+      <w:hyperlink r:id="rId21" w:tgtFrame="_blank" w:history="1">
         <w:r>
           <w:rPr>
             <w:rStyle w:val="Hyperlink"/>
@@ -5655,6 +6512,7 @@
         <w:jc w:val="both"/>
       </w:pPr>
       <w:r>
+        <w:lastRenderedPageBreak/>
         <w:t xml:space="preserve">Villar, A., &amp; Velini de Andrade, C. R. (2024). Supervised machine learning algorithms for predicting student dropout and academic success: A comparative study. </w:t>
       </w:r>
       <w:r>
@@ -5667,7 +6525,7 @@
       <w:r>
         <w:t xml:space="preserve">, 4(2). </w:t>
       </w:r>
-      <w:hyperlink r:id="rId17" w:tgtFrame="_blank" w:history="1">
+      <w:hyperlink r:id="rId22" w:tgtFrame="_blank" w:history="1">
         <w:r>
           <w:rPr>
             <w:rStyle w:val="Hyperlink"/>
@@ -5695,7 +6553,7 @@
       <w:r>
         <w:t xml:space="preserve">, 5(5). </w:t>
       </w:r>
-      <w:hyperlink r:id="rId18" w:tgtFrame="_blank" w:history="1">
+      <w:hyperlink r:id="rId23" w:tgtFrame="_blank" w:history="1">
         <w:r>
           <w:rPr>
             <w:rStyle w:val="Hyperlink"/>
@@ -5711,8 +6569,15 @@
         <w:jc w:val="both"/>
       </w:pPr>
     </w:p>
+    <w:p>
+      <w:pPr>
+        <w:spacing w:after="160" w:line="360" w:lineRule="auto"/>
+        <w:ind w:left="720" w:hanging="720"/>
+        <w:jc w:val="both"/>
+      </w:pPr>
+    </w:p>
     <w:sectPr>
-      <w:footerReference w:type="default" r:id="rId19"/>
+      <w:footerReference w:type="default" r:id="rId24"/>
       <w:pgSz w:w="11906" w:h="16838"/>
       <w:pgMar w:top="900" w:right="1440" w:bottom="1440" w:left="1800" w:header="708" w:footer="708" w:gutter="0"/>
       <w:pgNumType w:start="1"/>
@@ -5809,6 +6674,304 @@
 <file path=word/numbering.xml><?xml version="1.0" encoding="utf-8"?>
 <w:numbering xmlns:wpc="http://schemas.microsoft.com/office/word/2010/wordprocessingCanvas" xmlns:cx="http://schemas.microsoft.com/office/drawing/2014/chartex" xmlns:cx1="http://schemas.microsoft.com/office/drawing/2015/9/8/chartex" xmlns:cx2="http://schemas.microsoft.com/office/drawing/2015/10/21/chartex" xmlns:cx3="http://schemas.microsoft.com/office/drawing/2016/5/9/chartex" xmlns:cx4="http://schemas.microsoft.com/office/drawing/2016/5/10/chartex" xmlns:cx5="http://schemas.microsoft.com/office/drawing/2016/5/11/chartex" xmlns:cx6="http://schemas.microsoft.com/office/drawing/2016/5/12/chartex" xmlns:cx7="http://schemas.microsoft.com/office/drawing/2016/5/13/chartex" xmlns:cx8="http://schemas.microsoft.com/office/drawing/2016/5/14/chartex" xmlns:mc="http://schemas.openxmlformats.org/markup-compatibility/2006" xmlns:aink="http://schemas.microsoft.com/office/drawing/2016/ink" xmlns:am3d="http://schemas.microsoft.com/office/drawing/2017/model3d" xmlns:o="urn:schemas-microsoft-com:office:office" xmlns:oel="http://schemas.microsoft.com/office/2019/extlst" xmlns:r="http://schemas.openxmlformats.org/officeDocument/2006/relationships" xmlns:m="http://schemas.openxmlformats.org/officeDocument/2006/math" xmlns:v="urn:schemas-microsoft-com:vml" xmlns:wp14="http://schemas.microsoft.com/office/word/2010/wordprocessingDrawing" xmlns:wp="http://schemas.openxmlformats.org/drawingml/2006/wordprocessingDrawing" xmlns:w10="urn:schemas-microsoft-com:office:word" xmlns:w="http://schemas.openxmlformats.org/wordprocessingml/2006/main" xmlns:w14="http://schemas.microsoft.com/office/word/2010/wordml" xmlns:w15="http://schemas.microsoft.com/office/word/2012/wordml" xmlns:w16cex="http://schemas.microsoft.com/office/word/2018/wordml/cex" xmlns:w16cid="http://schemas.microsoft.com/office/word/2016/wordml/cid" xmlns:w16="http://schemas.microsoft.com/office/word/2018/wordml" xmlns:w16du="http://schemas.microsoft.com/office/word/2023/wordml/word16du" xmlns:w16sdtdh="http://schemas.microsoft.com/office/word/2020/wordml/sdtdatahash" xmlns:w16sdtfl="http://schemas.microsoft.com/office/word/2024/wordml/sdtformatlock" xmlns:w16se="http://schemas.microsoft.com/office/word/2015/wordml/symex" xmlns:wpg="http://schemas.microsoft.com/office/word/2010/wordprocessingGroup" xmlns:wpi="http://schemas.microsoft.com/office/word/2010/wordprocessingInk" xmlns:wne="http://schemas.microsoft.com/office/word/2006/wordml" xmlns:wps="http://schemas.microsoft.com/office/word/2010/wordprocessingShape" mc:Ignorable="w14 w15 w16se w16cid w16 w16cex w16sdtdh w16sdtfl w16du wp14">
   <w:abstractNum w:abstractNumId="0" w15:restartNumberingAfterBreak="0">
+    <w:nsid w:val="05E836DB"/>
+    <w:multiLevelType w:val="multilevel"/>
+    <w:tmpl w:val="396A0048"/>
+    <w:lvl w:ilvl="0">
+      <w:start w:val="1"/>
+      <w:numFmt w:val="bullet"/>
+      <w:lvlText w:val=""/>
+      <w:lvlJc w:val="left"/>
+      <w:pPr>
+        <w:tabs>
+          <w:tab w:val="num" w:pos="720"/>
+        </w:tabs>
+        <w:ind w:left="720" w:hanging="360"/>
+      </w:pPr>
+      <w:rPr>
+        <w:rFonts w:ascii="Wingdings" w:hAnsi="Wingdings" w:hint="default"/>
+        <w:sz w:val="20"/>
+      </w:rPr>
+    </w:lvl>
+    <w:lvl w:ilvl="1" w:tentative="1">
+      <w:start w:val="1"/>
+      <w:numFmt w:val="bullet"/>
+      <w:lvlText w:val="o"/>
+      <w:lvlJc w:val="left"/>
+      <w:pPr>
+        <w:tabs>
+          <w:tab w:val="num" w:pos="1440"/>
+        </w:tabs>
+        <w:ind w:left="1440" w:hanging="360"/>
+      </w:pPr>
+      <w:rPr>
+        <w:rFonts w:ascii="Courier New" w:hAnsi="Courier New" w:hint="default"/>
+        <w:sz w:val="20"/>
+      </w:rPr>
+    </w:lvl>
+    <w:lvl w:ilvl="2" w:tentative="1">
+      <w:start w:val="1"/>
+      <w:numFmt w:val="bullet"/>
+      <w:lvlText w:val=""/>
+      <w:lvlJc w:val="left"/>
+      <w:pPr>
+        <w:tabs>
+          <w:tab w:val="num" w:pos="2160"/>
+        </w:tabs>
+        <w:ind w:left="2160" w:hanging="360"/>
+      </w:pPr>
+      <w:rPr>
+        <w:rFonts w:ascii="Wingdings" w:hAnsi="Wingdings" w:hint="default"/>
+        <w:sz w:val="20"/>
+      </w:rPr>
+    </w:lvl>
+    <w:lvl w:ilvl="3" w:tentative="1">
+      <w:start w:val="1"/>
+      <w:numFmt w:val="bullet"/>
+      <w:lvlText w:val=""/>
+      <w:lvlJc w:val="left"/>
+      <w:pPr>
+        <w:tabs>
+          <w:tab w:val="num" w:pos="2880"/>
+        </w:tabs>
+        <w:ind w:left="2880" w:hanging="360"/>
+      </w:pPr>
+      <w:rPr>
+        <w:rFonts w:ascii="Wingdings" w:hAnsi="Wingdings" w:hint="default"/>
+        <w:sz w:val="20"/>
+      </w:rPr>
+    </w:lvl>
+    <w:lvl w:ilvl="4" w:tentative="1">
+      <w:start w:val="1"/>
+      <w:numFmt w:val="bullet"/>
+      <w:lvlText w:val=""/>
+      <w:lvlJc w:val="left"/>
+      <w:pPr>
+        <w:tabs>
+          <w:tab w:val="num" w:pos="3600"/>
+        </w:tabs>
+        <w:ind w:left="3600" w:hanging="360"/>
+      </w:pPr>
+      <w:rPr>
+        <w:rFonts w:ascii="Wingdings" w:hAnsi="Wingdings" w:hint="default"/>
+        <w:sz w:val="20"/>
+      </w:rPr>
+    </w:lvl>
+    <w:lvl w:ilvl="5" w:tentative="1">
+      <w:start w:val="1"/>
+      <w:numFmt w:val="bullet"/>
+      <w:lvlText w:val=""/>
+      <w:lvlJc w:val="left"/>
+      <w:pPr>
+        <w:tabs>
+          <w:tab w:val="num" w:pos="4320"/>
+        </w:tabs>
+        <w:ind w:left="4320" w:hanging="360"/>
+      </w:pPr>
+      <w:rPr>
+        <w:rFonts w:ascii="Wingdings" w:hAnsi="Wingdings" w:hint="default"/>
+        <w:sz w:val="20"/>
+      </w:rPr>
+    </w:lvl>
+    <w:lvl w:ilvl="6" w:tentative="1">
+      <w:start w:val="1"/>
+      <w:numFmt w:val="bullet"/>
+      <w:lvlText w:val=""/>
+      <w:lvlJc w:val="left"/>
+      <w:pPr>
+        <w:tabs>
+          <w:tab w:val="num" w:pos="5040"/>
+        </w:tabs>
+        <w:ind w:left="5040" w:hanging="360"/>
+      </w:pPr>
+      <w:rPr>
+        <w:rFonts w:ascii="Wingdings" w:hAnsi="Wingdings" w:hint="default"/>
+        <w:sz w:val="20"/>
+      </w:rPr>
+    </w:lvl>
+    <w:lvl w:ilvl="7" w:tentative="1">
+      <w:start w:val="1"/>
+      <w:numFmt w:val="bullet"/>
+      <w:lvlText w:val=""/>
+      <w:lvlJc w:val="left"/>
+      <w:pPr>
+        <w:tabs>
+          <w:tab w:val="num" w:pos="5760"/>
+        </w:tabs>
+        <w:ind w:left="5760" w:hanging="360"/>
+      </w:pPr>
+      <w:rPr>
+        <w:rFonts w:ascii="Wingdings" w:hAnsi="Wingdings" w:hint="default"/>
+        <w:sz w:val="20"/>
+      </w:rPr>
+    </w:lvl>
+    <w:lvl w:ilvl="8" w:tentative="1">
+      <w:start w:val="1"/>
+      <w:numFmt w:val="bullet"/>
+      <w:lvlText w:val=""/>
+      <w:lvlJc w:val="left"/>
+      <w:pPr>
+        <w:tabs>
+          <w:tab w:val="num" w:pos="6480"/>
+        </w:tabs>
+        <w:ind w:left="6480" w:hanging="360"/>
+      </w:pPr>
+      <w:rPr>
+        <w:rFonts w:ascii="Wingdings" w:hAnsi="Wingdings" w:hint="default"/>
+        <w:sz w:val="20"/>
+      </w:rPr>
+    </w:lvl>
+  </w:abstractNum>
+  <w:abstractNum w:abstractNumId="1" w15:restartNumberingAfterBreak="0">
+    <w:nsid w:val="126E2B10"/>
+    <w:multiLevelType w:val="multilevel"/>
+    <w:tmpl w:val="81B8F3FC"/>
+    <w:lvl w:ilvl="0">
+      <w:start w:val="1"/>
+      <w:numFmt w:val="bullet"/>
+      <w:lvlText w:val=""/>
+      <w:lvlJc w:val="left"/>
+      <w:pPr>
+        <w:tabs>
+          <w:tab w:val="num" w:pos="720"/>
+        </w:tabs>
+        <w:ind w:left="720" w:hanging="360"/>
+      </w:pPr>
+      <w:rPr>
+        <w:rFonts w:ascii="Symbol" w:hAnsi="Symbol" w:hint="default"/>
+        <w:sz w:val="20"/>
+      </w:rPr>
+    </w:lvl>
+    <w:lvl w:ilvl="1" w:tentative="1">
+      <w:start w:val="1"/>
+      <w:numFmt w:val="bullet"/>
+      <w:lvlText w:val="o"/>
+      <w:lvlJc w:val="left"/>
+      <w:pPr>
+        <w:tabs>
+          <w:tab w:val="num" w:pos="1440"/>
+        </w:tabs>
+        <w:ind w:left="1440" w:hanging="360"/>
+      </w:pPr>
+      <w:rPr>
+        <w:rFonts w:ascii="Courier New" w:hAnsi="Courier New" w:hint="default"/>
+        <w:sz w:val="20"/>
+      </w:rPr>
+    </w:lvl>
+    <w:lvl w:ilvl="2" w:tentative="1">
+      <w:start w:val="1"/>
+      <w:numFmt w:val="bullet"/>
+      <w:lvlText w:val=""/>
+      <w:lvlJc w:val="left"/>
+      <w:pPr>
+        <w:tabs>
+          <w:tab w:val="num" w:pos="2160"/>
+        </w:tabs>
+        <w:ind w:left="2160" w:hanging="360"/>
+      </w:pPr>
+      <w:rPr>
+        <w:rFonts w:ascii="Wingdings" w:hAnsi="Wingdings" w:hint="default"/>
+        <w:sz w:val="20"/>
+      </w:rPr>
+    </w:lvl>
+    <w:lvl w:ilvl="3" w:tentative="1">
+      <w:start w:val="1"/>
+      <w:numFmt w:val="bullet"/>
+      <w:lvlText w:val=""/>
+      <w:lvlJc w:val="left"/>
+      <w:pPr>
+        <w:tabs>
+          <w:tab w:val="num" w:pos="2880"/>
+        </w:tabs>
+        <w:ind w:left="2880" w:hanging="360"/>
+      </w:pPr>
+      <w:rPr>
+        <w:rFonts w:ascii="Wingdings" w:hAnsi="Wingdings" w:hint="default"/>
+        <w:sz w:val="20"/>
+      </w:rPr>
+    </w:lvl>
+    <w:lvl w:ilvl="4" w:tentative="1">
+      <w:start w:val="1"/>
+      <w:numFmt w:val="bullet"/>
+      <w:lvlText w:val=""/>
+      <w:lvlJc w:val="left"/>
+      <w:pPr>
+        <w:tabs>
+          <w:tab w:val="num" w:pos="3600"/>
+        </w:tabs>
+        <w:ind w:left="3600" w:hanging="360"/>
+      </w:pPr>
+      <w:rPr>
+        <w:rFonts w:ascii="Wingdings" w:hAnsi="Wingdings" w:hint="default"/>
+        <w:sz w:val="20"/>
+      </w:rPr>
+    </w:lvl>
+    <w:lvl w:ilvl="5" w:tentative="1">
+      <w:start w:val="1"/>
+      <w:numFmt w:val="bullet"/>
+      <w:lvlText w:val=""/>
+      <w:lvlJc w:val="left"/>
+      <w:pPr>
+        <w:tabs>
+          <w:tab w:val="num" w:pos="4320"/>
+        </w:tabs>
+        <w:ind w:left="4320" w:hanging="360"/>
+      </w:pPr>
+      <w:rPr>
+        <w:rFonts w:ascii="Wingdings" w:hAnsi="Wingdings" w:hint="default"/>
+        <w:sz w:val="20"/>
+      </w:rPr>
+    </w:lvl>
+    <w:lvl w:ilvl="6" w:tentative="1">
+      <w:start w:val="1"/>
+      <w:numFmt w:val="bullet"/>
+      <w:lvlText w:val=""/>
+      <w:lvlJc w:val="left"/>
+      <w:pPr>
+        <w:tabs>
+          <w:tab w:val="num" w:pos="5040"/>
+        </w:tabs>
+        <w:ind w:left="5040" w:hanging="360"/>
+      </w:pPr>
+      <w:rPr>
+        <w:rFonts w:ascii="Wingdings" w:hAnsi="Wingdings" w:hint="default"/>
+        <w:sz w:val="20"/>
+      </w:rPr>
+    </w:lvl>
+    <w:lvl w:ilvl="7" w:tentative="1">
+      <w:start w:val="1"/>
+      <w:numFmt w:val="bullet"/>
+      <w:lvlText w:val=""/>
+      <w:lvlJc w:val="left"/>
+      <w:pPr>
+        <w:tabs>
+          <w:tab w:val="num" w:pos="5760"/>
+        </w:tabs>
+        <w:ind w:left="5760" w:hanging="360"/>
+      </w:pPr>
+      <w:rPr>
+        <w:rFonts w:ascii="Wingdings" w:hAnsi="Wingdings" w:hint="default"/>
+        <w:sz w:val="20"/>
+      </w:rPr>
+    </w:lvl>
+    <w:lvl w:ilvl="8" w:tentative="1">
+      <w:start w:val="1"/>
+      <w:numFmt w:val="bullet"/>
+      <w:lvlText w:val=""/>
+      <w:lvlJc w:val="left"/>
+      <w:pPr>
+        <w:tabs>
+          <w:tab w:val="num" w:pos="6480"/>
+        </w:tabs>
+        <w:ind w:left="6480" w:hanging="360"/>
+      </w:pPr>
+      <w:rPr>
+        <w:rFonts w:ascii="Wingdings" w:hAnsi="Wingdings" w:hint="default"/>
+        <w:sz w:val="20"/>
+      </w:rPr>
+    </w:lvl>
+  </w:abstractNum>
+  <w:abstractNum w:abstractNumId="2" w15:restartNumberingAfterBreak="0">
     <w:nsid w:val="156A3A21"/>
     <w:multiLevelType w:val="multilevel"/>
     <w:tmpl w:val="6C6E43FE"/>
@@ -5921,7 +7084,7 @@
       </w:rPr>
     </w:lvl>
   </w:abstractNum>
-  <w:abstractNum w:abstractNumId="1" w15:restartNumberingAfterBreak="0">
+  <w:abstractNum w:abstractNumId="3" w15:restartNumberingAfterBreak="0">
     <w:nsid w:val="2A941BBB"/>
     <w:multiLevelType w:val="hybridMultilevel"/>
     <w:tmpl w:val="0D4A1228"/>
@@ -6007,7 +7170,7 @@
       </w:pPr>
     </w:lvl>
   </w:abstractNum>
-  <w:abstractNum w:abstractNumId="2" w15:restartNumberingAfterBreak="0">
+  <w:abstractNum w:abstractNumId="4" w15:restartNumberingAfterBreak="0">
     <w:nsid w:val="33C127AB"/>
     <w:multiLevelType w:val="hybridMultilevel"/>
     <w:tmpl w:val="C16023E6"/>
@@ -6120,7 +7283,7 @@
       </w:rPr>
     </w:lvl>
   </w:abstractNum>
-  <w:abstractNum w:abstractNumId="3" w15:restartNumberingAfterBreak="0">
+  <w:abstractNum w:abstractNumId="5" w15:restartNumberingAfterBreak="0">
     <w:nsid w:val="45E94EF4"/>
     <w:multiLevelType w:val="hybridMultilevel"/>
     <w:tmpl w:val="7DAA61EE"/>
@@ -6233,7 +7396,117 @@
       </w:rPr>
     </w:lvl>
   </w:abstractNum>
-  <w:abstractNum w:abstractNumId="4" w15:restartNumberingAfterBreak="0">
+  <w:abstractNum w:abstractNumId="6" w15:restartNumberingAfterBreak="0">
+    <w:nsid w:val="53DC5FEF"/>
+    <w:multiLevelType w:val="multilevel"/>
+    <w:tmpl w:val="C08ADFCC"/>
+    <w:lvl w:ilvl="0">
+      <w:start w:val="1"/>
+      <w:numFmt w:val="decimal"/>
+      <w:lvlText w:val="%1."/>
+      <w:lvlJc w:val="left"/>
+      <w:pPr>
+        <w:tabs>
+          <w:tab w:val="num" w:pos="720"/>
+        </w:tabs>
+        <w:ind w:left="720" w:hanging="360"/>
+      </w:pPr>
+    </w:lvl>
+    <w:lvl w:ilvl="1">
+      <w:start w:val="1"/>
+      <w:numFmt w:val="lowerRoman"/>
+      <w:lvlText w:val="%2."/>
+      <w:lvlJc w:val="right"/>
+      <w:pPr>
+        <w:ind w:left="1440" w:hanging="360"/>
+      </w:pPr>
+    </w:lvl>
+    <w:lvl w:ilvl="2" w:tentative="1">
+      <w:start w:val="1"/>
+      <w:numFmt w:val="decimal"/>
+      <w:lvlText w:val="%3."/>
+      <w:lvlJc w:val="left"/>
+      <w:pPr>
+        <w:tabs>
+          <w:tab w:val="num" w:pos="2160"/>
+        </w:tabs>
+        <w:ind w:left="2160" w:hanging="360"/>
+      </w:pPr>
+    </w:lvl>
+    <w:lvl w:ilvl="3" w:tentative="1">
+      <w:start w:val="1"/>
+      <w:numFmt w:val="decimal"/>
+      <w:lvlText w:val="%4."/>
+      <w:lvlJc w:val="left"/>
+      <w:pPr>
+        <w:tabs>
+          <w:tab w:val="num" w:pos="2880"/>
+        </w:tabs>
+        <w:ind w:left="2880" w:hanging="360"/>
+      </w:pPr>
+    </w:lvl>
+    <w:lvl w:ilvl="4" w:tentative="1">
+      <w:start w:val="1"/>
+      <w:numFmt w:val="decimal"/>
+      <w:lvlText w:val="%5."/>
+      <w:lvlJc w:val="left"/>
+      <w:pPr>
+        <w:tabs>
+          <w:tab w:val="num" w:pos="3600"/>
+        </w:tabs>
+        <w:ind w:left="3600" w:hanging="360"/>
+      </w:pPr>
+    </w:lvl>
+    <w:lvl w:ilvl="5" w:tentative="1">
+      <w:start w:val="1"/>
+      <w:numFmt w:val="decimal"/>
+      <w:lvlText w:val="%6."/>
+      <w:lvlJc w:val="left"/>
+      <w:pPr>
+        <w:tabs>
+          <w:tab w:val="num" w:pos="4320"/>
+        </w:tabs>
+        <w:ind w:left="4320" w:hanging="360"/>
+      </w:pPr>
+    </w:lvl>
+    <w:lvl w:ilvl="6" w:tentative="1">
+      <w:start w:val="1"/>
+      <w:numFmt w:val="decimal"/>
+      <w:lvlText w:val="%7."/>
+      <w:lvlJc w:val="left"/>
+      <w:pPr>
+        <w:tabs>
+          <w:tab w:val="num" w:pos="5040"/>
+        </w:tabs>
+        <w:ind w:left="5040" w:hanging="360"/>
+      </w:pPr>
+    </w:lvl>
+    <w:lvl w:ilvl="7" w:tentative="1">
+      <w:start w:val="1"/>
+      <w:numFmt w:val="decimal"/>
+      <w:lvlText w:val="%8."/>
+      <w:lvlJc w:val="left"/>
+      <w:pPr>
+        <w:tabs>
+          <w:tab w:val="num" w:pos="5760"/>
+        </w:tabs>
+        <w:ind w:left="5760" w:hanging="360"/>
+      </w:pPr>
+    </w:lvl>
+    <w:lvl w:ilvl="8" w:tentative="1">
+      <w:start w:val="1"/>
+      <w:numFmt w:val="decimal"/>
+      <w:lvlText w:val="%9."/>
+      <w:lvlJc w:val="left"/>
+      <w:pPr>
+        <w:tabs>
+          <w:tab w:val="num" w:pos="6480"/>
+        </w:tabs>
+        <w:ind w:left="6480" w:hanging="360"/>
+      </w:pPr>
+    </w:lvl>
+  </w:abstractNum>
+  <w:abstractNum w:abstractNumId="7" w15:restartNumberingAfterBreak="0">
     <w:nsid w:val="59CF14D1"/>
     <w:multiLevelType w:val="hybridMultilevel"/>
     <w:tmpl w:val="987A029C"/>
@@ -6319,7 +7592,7 @@
       </w:pPr>
     </w:lvl>
   </w:abstractNum>
-  <w:abstractNum w:abstractNumId="5" w15:restartNumberingAfterBreak="0">
+  <w:abstractNum w:abstractNumId="8" w15:restartNumberingAfterBreak="0">
     <w:nsid w:val="5B9B08D9"/>
     <w:multiLevelType w:val="hybridMultilevel"/>
     <w:tmpl w:val="066E2856"/>
@@ -6431,7 +7704,210 @@
       </w:rPr>
     </w:lvl>
   </w:abstractNum>
-  <w:abstractNum w:abstractNumId="6" w15:restartNumberingAfterBreak="0">
+  <w:abstractNum w:abstractNumId="9" w15:restartNumberingAfterBreak="0">
+    <w:nsid w:val="68067BE7"/>
+    <w:multiLevelType w:val="hybridMultilevel"/>
+    <w:tmpl w:val="20DE4568"/>
+    <w:lvl w:ilvl="0" w:tplc="0409000F">
+      <w:start w:val="1"/>
+      <w:numFmt w:val="decimal"/>
+      <w:lvlText w:val="%1."/>
+      <w:lvlJc w:val="left"/>
+      <w:pPr>
+        <w:ind w:left="720" w:hanging="360"/>
+      </w:pPr>
+    </w:lvl>
+    <w:lvl w:ilvl="1" w:tplc="04090019" w:tentative="1">
+      <w:start w:val="1"/>
+      <w:numFmt w:val="lowerLetter"/>
+      <w:lvlText w:val="%2."/>
+      <w:lvlJc w:val="left"/>
+      <w:pPr>
+        <w:ind w:left="1440" w:hanging="360"/>
+      </w:pPr>
+    </w:lvl>
+    <w:lvl w:ilvl="2" w:tplc="0409001B" w:tentative="1">
+      <w:start w:val="1"/>
+      <w:numFmt w:val="lowerRoman"/>
+      <w:lvlText w:val="%3."/>
+      <w:lvlJc w:val="right"/>
+      <w:pPr>
+        <w:ind w:left="2160" w:hanging="180"/>
+      </w:pPr>
+    </w:lvl>
+    <w:lvl w:ilvl="3" w:tplc="0409000F" w:tentative="1">
+      <w:start w:val="1"/>
+      <w:numFmt w:val="decimal"/>
+      <w:lvlText w:val="%4."/>
+      <w:lvlJc w:val="left"/>
+      <w:pPr>
+        <w:ind w:left="2880" w:hanging="360"/>
+      </w:pPr>
+    </w:lvl>
+    <w:lvl w:ilvl="4" w:tplc="04090019" w:tentative="1">
+      <w:start w:val="1"/>
+      <w:numFmt w:val="lowerLetter"/>
+      <w:lvlText w:val="%5."/>
+      <w:lvlJc w:val="left"/>
+      <w:pPr>
+        <w:ind w:left="3600" w:hanging="360"/>
+      </w:pPr>
+    </w:lvl>
+    <w:lvl w:ilvl="5" w:tplc="0409001B" w:tentative="1">
+      <w:start w:val="1"/>
+      <w:numFmt w:val="lowerRoman"/>
+      <w:lvlText w:val="%6."/>
+      <w:lvlJc w:val="right"/>
+      <w:pPr>
+        <w:ind w:left="4320" w:hanging="180"/>
+      </w:pPr>
+    </w:lvl>
+    <w:lvl w:ilvl="6" w:tplc="0409000F" w:tentative="1">
+      <w:start w:val="1"/>
+      <w:numFmt w:val="decimal"/>
+      <w:lvlText w:val="%7."/>
+      <w:lvlJc w:val="left"/>
+      <w:pPr>
+        <w:ind w:left="5040" w:hanging="360"/>
+      </w:pPr>
+    </w:lvl>
+    <w:lvl w:ilvl="7" w:tplc="04090019" w:tentative="1">
+      <w:start w:val="1"/>
+      <w:numFmt w:val="lowerLetter"/>
+      <w:lvlText w:val="%8."/>
+      <w:lvlJc w:val="left"/>
+      <w:pPr>
+        <w:ind w:left="5760" w:hanging="360"/>
+      </w:pPr>
+    </w:lvl>
+    <w:lvl w:ilvl="8" w:tplc="0409001B" w:tentative="1">
+      <w:start w:val="1"/>
+      <w:numFmt w:val="lowerRoman"/>
+      <w:lvlText w:val="%9."/>
+      <w:lvlJc w:val="right"/>
+      <w:pPr>
+        <w:ind w:left="6480" w:hanging="180"/>
+      </w:pPr>
+    </w:lvl>
+  </w:abstractNum>
+  <w:abstractNum w:abstractNumId="10" w15:restartNumberingAfterBreak="0">
+    <w:nsid w:val="799F207F"/>
+    <w:multiLevelType w:val="multilevel"/>
+    <w:tmpl w:val="E4F06304"/>
+    <w:lvl w:ilvl="0">
+      <w:start w:val="1"/>
+      <w:numFmt w:val="decimal"/>
+      <w:lvlText w:val="%1."/>
+      <w:lvlJc w:val="left"/>
+      <w:pPr>
+        <w:tabs>
+          <w:tab w:val="num" w:pos="720"/>
+        </w:tabs>
+        <w:ind w:left="720" w:hanging="360"/>
+      </w:pPr>
+    </w:lvl>
+    <w:lvl w:ilvl="1">
+      <w:start w:val="1"/>
+      <w:numFmt w:val="bullet"/>
+      <w:lvlText w:val="o"/>
+      <w:lvlJc w:val="left"/>
+      <w:pPr>
+        <w:tabs>
+          <w:tab w:val="num" w:pos="1440"/>
+        </w:tabs>
+        <w:ind w:left="1440" w:hanging="360"/>
+      </w:pPr>
+      <w:rPr>
+        <w:rFonts w:ascii="Courier New" w:hAnsi="Courier New" w:hint="default"/>
+        <w:sz w:val="20"/>
+      </w:rPr>
+    </w:lvl>
+    <w:lvl w:ilvl="2" w:tentative="1">
+      <w:start w:val="1"/>
+      <w:numFmt w:val="decimal"/>
+      <w:lvlText w:val="%3."/>
+      <w:lvlJc w:val="left"/>
+      <w:pPr>
+        <w:tabs>
+          <w:tab w:val="num" w:pos="2160"/>
+        </w:tabs>
+        <w:ind w:left="2160" w:hanging="360"/>
+      </w:pPr>
+    </w:lvl>
+    <w:lvl w:ilvl="3" w:tentative="1">
+      <w:start w:val="1"/>
+      <w:numFmt w:val="decimal"/>
+      <w:lvlText w:val="%4."/>
+      <w:lvlJc w:val="left"/>
+      <w:pPr>
+        <w:tabs>
+          <w:tab w:val="num" w:pos="2880"/>
+        </w:tabs>
+        <w:ind w:left="2880" w:hanging="360"/>
+      </w:pPr>
+    </w:lvl>
+    <w:lvl w:ilvl="4" w:tentative="1">
+      <w:start w:val="1"/>
+      <w:numFmt w:val="decimal"/>
+      <w:lvlText w:val="%5."/>
+      <w:lvlJc w:val="left"/>
+      <w:pPr>
+        <w:tabs>
+          <w:tab w:val="num" w:pos="3600"/>
+        </w:tabs>
+        <w:ind w:left="3600" w:hanging="360"/>
+      </w:pPr>
+    </w:lvl>
+    <w:lvl w:ilvl="5" w:tentative="1">
+      <w:start w:val="1"/>
+      <w:numFmt w:val="decimal"/>
+      <w:lvlText w:val="%6."/>
+      <w:lvlJc w:val="left"/>
+      <w:pPr>
+        <w:tabs>
+          <w:tab w:val="num" w:pos="4320"/>
+        </w:tabs>
+        <w:ind w:left="4320" w:hanging="360"/>
+      </w:pPr>
+    </w:lvl>
+    <w:lvl w:ilvl="6" w:tentative="1">
+      <w:start w:val="1"/>
+      <w:numFmt w:val="decimal"/>
+      <w:lvlText w:val="%7."/>
+      <w:lvlJc w:val="left"/>
+      <w:pPr>
+        <w:tabs>
+          <w:tab w:val="num" w:pos="5040"/>
+        </w:tabs>
+        <w:ind w:left="5040" w:hanging="360"/>
+      </w:pPr>
+    </w:lvl>
+    <w:lvl w:ilvl="7" w:tentative="1">
+      <w:start w:val="1"/>
+      <w:numFmt w:val="decimal"/>
+      <w:lvlText w:val="%8."/>
+      <w:lvlJc w:val="left"/>
+      <w:pPr>
+        <w:tabs>
+          <w:tab w:val="num" w:pos="5760"/>
+        </w:tabs>
+        <w:ind w:left="5760" w:hanging="360"/>
+      </w:pPr>
+    </w:lvl>
+    <w:lvl w:ilvl="8" w:tentative="1">
+      <w:start w:val="1"/>
+      <w:numFmt w:val="decimal"/>
+      <w:lvlText w:val="%9."/>
+      <w:lvlJc w:val="left"/>
+      <w:pPr>
+        <w:tabs>
+          <w:tab w:val="num" w:pos="6480"/>
+        </w:tabs>
+        <w:ind w:left="6480" w:hanging="360"/>
+      </w:pPr>
+    </w:lvl>
+  </w:abstractNum>
+  <w:abstractNum w:abstractNumId="11" w15:restartNumberingAfterBreak="0">
     <w:nsid w:val="7AFE4549"/>
     <w:multiLevelType w:val="multilevel"/>
     <w:tmpl w:val="A412AEDC"/>
@@ -6545,25 +8021,40 @@
     </w:lvl>
   </w:abstractNum>
   <w:num w:numId="1" w16cid:durableId="14312008">
+    <w:abstractNumId w:val="11"/>
+  </w:num>
+  <w:num w:numId="2" w16cid:durableId="1084106612">
+    <w:abstractNumId w:val="2"/>
+  </w:num>
+  <w:num w:numId="3" w16cid:durableId="213934350">
+    <w:abstractNumId w:val="3"/>
+  </w:num>
+  <w:num w:numId="4" w16cid:durableId="1400516528">
+    <w:abstractNumId w:val="8"/>
+  </w:num>
+  <w:num w:numId="5" w16cid:durableId="1564874995">
+    <w:abstractNumId w:val="7"/>
+  </w:num>
+  <w:num w:numId="6" w16cid:durableId="1432899904">
+    <w:abstractNumId w:val="5"/>
+  </w:num>
+  <w:num w:numId="7" w16cid:durableId="1903591156">
+    <w:abstractNumId w:val="4"/>
+  </w:num>
+  <w:num w:numId="8" w16cid:durableId="12926715">
+    <w:abstractNumId w:val="9"/>
+  </w:num>
+  <w:num w:numId="9" w16cid:durableId="140536199">
+    <w:abstractNumId w:val="10"/>
+  </w:num>
+  <w:num w:numId="10" w16cid:durableId="372465405">
     <w:abstractNumId w:val="6"/>
   </w:num>
-  <w:num w:numId="2" w16cid:durableId="1084106612">
-    <w:abstractNumId w:val="0"/>
-  </w:num>
-  <w:num w:numId="3" w16cid:durableId="213934350">
+  <w:num w:numId="11" w16cid:durableId="1427070450">
     <w:abstractNumId w:val="1"/>
   </w:num>
-  <w:num w:numId="4" w16cid:durableId="1400516528">
-    <w:abstractNumId w:val="5"/>
-  </w:num>
-  <w:num w:numId="5" w16cid:durableId="1564874995">
-    <w:abstractNumId w:val="4"/>
-  </w:num>
-  <w:num w:numId="6" w16cid:durableId="1432899904">
-    <w:abstractNumId w:val="3"/>
-  </w:num>
-  <w:num w:numId="7" w16cid:durableId="1903591156">
-    <w:abstractNumId w:val="2"/>
+  <w:num w:numId="12" w16cid:durableId="754084487">
+    <w:abstractNumId w:val="0"/>
   </w:num>
 </w:numbering>
 </file>

</xml_diff>